<commit_message>
Tighten hiragana PDF layout
Co-authored-by: sin-boo <sin-boo@users.noreply.github.com>
</commit_message>
<xml_diff>
--- a/japanese_docs/output/docs/hiragana_series/hira_01_vowels.docx
+++ b/japanese_docs/output/docs/hiragana_series/hira_01_vowels.docx
@@ -243,7 +243,7 @@
     <w:p>
       <w:pPr>
         <w:pStyle w:val="ListBullet"/>
-        <w:spacing w:before="0" w:after="20"/>
+        <w:spacing w:before="0" w:after="0"/>
         <w:ind w:left="340"/>
       </w:pPr>
       <w:r>
@@ -252,7 +252,7 @@
           <w:b w:val="0"/>
           <w:i w:val="0"/>
           <w:color w:val="1A1A2E"/>
-          <w:sz w:val="20"/>
+          <w:sz w:val="18"/>
         </w:rPr>
         <w:t>This worksheet focuses on the set: あ い う え お.</w:t>
       </w:r>
@@ -260,7 +260,7 @@
     <w:p>
       <w:pPr>
         <w:pStyle w:val="ListBullet"/>
-        <w:spacing w:before="0" w:after="20"/>
+        <w:spacing w:before="0" w:after="0"/>
         <w:ind w:left="340"/>
       </w:pPr>
       <w:r>
@@ -269,15 +269,15 @@
           <w:b w:val="0"/>
           <w:i w:val="0"/>
           <w:color w:val="1A1A2E"/>
-          <w:sz w:val="20"/>
+          <w:sz w:val="18"/>
         </w:rPr>
-        <w:t>Each hiragana letter stands for one sound chunk or beat. Read one kana smoothly instead of spelling it out like separate English letters.</w:t>
+        <w:t>Each hiragana letter stands for one sound chunk or beat.</w:t>
       </w:r>
     </w:p>
     <w:p>
       <w:pPr>
         <w:pStyle w:val="ListBullet"/>
-        <w:spacing w:before="0" w:after="20"/>
+        <w:spacing w:before="0" w:after="0"/>
         <w:ind w:left="340"/>
       </w:pPr>
       <w:r>
@@ -286,7 +286,7 @@
           <w:b w:val="0"/>
           <w:i w:val="0"/>
           <w:color w:val="1A1A2E"/>
-          <w:sz w:val="20"/>
+          <w:sz w:val="18"/>
         </w:rPr>
         <w:t>Learn the five basic vowel sounds. These vowels appear in almost every Japanese word.</w:t>
       </w:r>
@@ -294,7 +294,7 @@
     <w:p>
       <w:pPr>
         <w:pStyle w:val="ListBullet"/>
-        <w:spacing w:before="0" w:after="20"/>
+        <w:spacing w:before="0" w:after="0"/>
         <w:ind w:left="340"/>
       </w:pPr>
       <w:r>
@@ -303,15 +303,15 @@
           <w:b w:val="0"/>
           <w:i w:val="0"/>
           <w:color w:val="1A1A2E"/>
-          <w:sz w:val="20"/>
+          <w:sz w:val="18"/>
         </w:rPr>
-        <w:t>These five vowels are the sound base of the whole hiragana chart: a, i, u, e, o.</w:t>
+        <w:t>These five vowels are the sound base of the whole hiragana chart: a, i, u, e, o. This set is very regular, so you can focus on the letter shape and the changing vowel sound.</w:t>
       </w:r>
     </w:p>
     <w:p>
       <w:pPr>
         <w:pStyle w:val="ListBullet"/>
-        <w:spacing w:before="0" w:after="20"/>
+        <w:spacing w:before="0" w:after="0"/>
         <w:ind w:left="340"/>
       </w:pPr>
       <w:r>
@@ -320,31 +320,14 @@
           <w:b w:val="0"/>
           <w:i w:val="0"/>
           <w:color w:val="1A1A2E"/>
-          <w:sz w:val="20"/>
-        </w:rPr>
-        <w:t>This set is very regular, so you can focus on the letter shape and the changing vowel sound.</w:t>
-      </w:r>
-    </w:p>
-    <w:p>
-      <w:pPr>
-        <w:pStyle w:val="ListBullet"/>
-        <w:spacing w:before="0" w:after="20"/>
-        <w:ind w:left="340"/>
-      </w:pPr>
-      <w:r>
-        <w:rPr>
-          <w:rFonts w:ascii="Calibri" w:hAnsi="Calibri"/>
-          <w:b w:val="0"/>
-          <w:i w:val="0"/>
-          <w:color w:val="1A1A2E"/>
-          <w:sz w:val="20"/>
+          <w:sz w:val="18"/>
         </w:rPr>
         <w:t>You will do two activities: write the reading from memory, then use row-pattern practice to check if you really know the set.</w:t>
       </w:r>
     </w:p>
     <w:p>
       <w:pPr>
-        <w:spacing w:after="20"/>
+        <w:spacing w:after="0"/>
       </w:pPr>
     </w:p>
     <w:p>
@@ -366,7 +349,7 @@
     </w:p>
     <w:p>
       <w:pPr>
-        <w:spacing w:before="20" w:after="40"/>
+        <w:spacing w:before="0" w:after="20"/>
       </w:pPr>
       <w:r>
         <w:rPr>
@@ -426,20 +409,19 @@
         <w:tblLook w:firstColumn="1" w:firstRow="1" w:lastColumn="0" w:lastRow="0" w:noHBand="0" w:noVBand="1" w:val="04A0"/>
       </w:tblPr>
       <w:tblGrid>
-        <w:gridCol w:w="3888"/>
-        <w:gridCol w:w="3888"/>
-        <w:gridCol w:w="3888"/>
+        <w:gridCol w:w="5832"/>
+        <w:gridCol w:w="5832"/>
       </w:tblGrid>
       <w:tr>
         <w:tc>
           <w:tcPr>
-            <w:tcW w:type="dxa" w:w="3888"/>
+            <w:tcW w:type="dxa" w:w="5832"/>
             <w:shd w:val="clear" w:color="auto" w:fill="F0F6FA"/>
             <w:vAlign w:val="top"/>
           </w:tcPr>
           <w:p>
             <w:pPr>
-              <w:spacing w:before="40" w:after="20"/>
+              <w:spacing w:before="20" w:after="0"/>
             </w:pPr>
             <w:r>
               <w:rPr>
@@ -447,7 +429,7 @@
                 <w:b/>
                 <w:i w:val="0"/>
                 <w:color w:val="007A87"/>
-                <w:sz w:val="18"/>
+                <w:sz w:val="16"/>
               </w:rPr>
               <w:t>Example</w:t>
             </w:r>
@@ -462,14 +444,14 @@
                 <w:b/>
                 <w:i w:val="0"/>
                 <w:color w:val="1A3A5C"/>
-                <w:sz w:val="22"/>
+                <w:sz w:val="20"/>
               </w:rPr>
               <w:t>さ  -&gt;  sa</w:t>
             </w:r>
           </w:p>
           <w:p>
             <w:pPr>
-              <w:spacing w:before="0" w:after="40"/>
+              <w:spacing w:before="0" w:after="20"/>
             </w:pPr>
             <w:r>
               <w:rPr>
@@ -477,7 +459,7 @@
                 <w:b w:val="0"/>
                 <w:i w:val="0"/>
                 <w:color w:val="1A1A2E"/>
-                <w:sz w:val="18"/>
+                <w:sz w:val="16"/>
               </w:rPr>
               <w:t>Answer: Example from a different row.</w:t>
             </w:r>
@@ -485,13 +467,13 @@
         </w:tc>
         <w:tc>
           <w:tcPr>
-            <w:tcW w:type="dxa" w:w="3888"/>
+            <w:tcW w:type="dxa" w:w="5832"/>
             <w:shd w:val="clear" w:color="auto" w:fill="F0F6FA"/>
             <w:vAlign w:val="top"/>
           </w:tcPr>
           <w:p>
             <w:pPr>
-              <w:spacing w:before="40" w:after="20"/>
+              <w:spacing w:before="20" w:after="0"/>
             </w:pPr>
             <w:r>
               <w:rPr>
@@ -499,7 +481,7 @@
                 <w:b/>
                 <w:i w:val="0"/>
                 <w:color w:val="007A87"/>
-                <w:sz w:val="18"/>
+                <w:sz w:val="16"/>
               </w:rPr>
               <w:t>Example</w:t>
             </w:r>
@@ -514,14 +496,14 @@
                 <w:b/>
                 <w:i w:val="0"/>
                 <w:color w:val="1A3A5C"/>
-                <w:sz w:val="22"/>
+                <w:sz w:val="20"/>
               </w:rPr>
-              <w:t>さし</w:t>
+              <w:t>さ  __  す  __  そ</w:t>
             </w:r>
           </w:p>
           <w:p>
             <w:pPr>
-              <w:spacing w:before="0" w:after="40"/>
+              <w:spacing w:before="0" w:after="20"/>
             </w:pPr>
             <w:r>
               <w:rPr>
@@ -529,59 +511,7 @@
                 <w:b w:val="0"/>
                 <w:i w:val="0"/>
                 <w:color w:val="1A1A2E"/>
-                <w:sz w:val="18"/>
-              </w:rPr>
-              <w:t>Answer: sa-shi</w:t>
-            </w:r>
-          </w:p>
-        </w:tc>
-        <w:tc>
-          <w:tcPr>
-            <w:tcW w:type="dxa" w:w="3888"/>
-            <w:shd w:val="clear" w:color="auto" w:fill="F0F6FA"/>
-            <w:vAlign w:val="top"/>
-          </w:tcPr>
-          <w:p>
-            <w:pPr>
-              <w:spacing w:before="40" w:after="20"/>
-            </w:pPr>
-            <w:r>
-              <w:rPr>
-                <w:rFonts w:ascii="Calibri" w:hAnsi="Calibri"/>
-                <w:b/>
-                <w:i w:val="0"/>
-                <w:color w:val="007A87"/>
-                <w:sz w:val="18"/>
-              </w:rPr>
-              <w:t>Example</w:t>
-            </w:r>
-          </w:p>
-          <w:p>
-            <w:pPr>
-              <w:spacing w:before="0" w:after="0"/>
-            </w:pPr>
-            <w:r>
-              <w:rPr>
-                <w:rFonts w:ascii="Calibri" w:hAnsi="Calibri"/>
-                <w:b/>
-                <w:i w:val="0"/>
-                <w:color w:val="1A3A5C"/>
-                <w:sz w:val="22"/>
-              </w:rPr>
-              <w:t>さ  __  す  __  そ</w:t>
-            </w:r>
-          </w:p>
-          <w:p>
-            <w:pPr>
-              <w:spacing w:before="0" w:after="40"/>
-            </w:pPr>
-            <w:r>
-              <w:rPr>
-                <w:rFonts w:ascii="Calibri" w:hAnsi="Calibri"/>
-                <w:b w:val="0"/>
-                <w:i w:val="0"/>
-                <w:color w:val="1A1A2E"/>
-                <w:sz w:val="18"/>
+                <w:sz w:val="16"/>
               </w:rPr>
               <w:t>Answer: し, せ</w:t>
             </w:r>
@@ -591,7 +521,7 @@
     </w:tbl>
     <w:p>
       <w:pPr>
-        <w:spacing w:after="20"/>
+        <w:spacing w:after="0"/>
       </w:pPr>
     </w:p>
     <w:p>
@@ -613,7 +543,7 @@
     </w:p>
     <w:p>
       <w:pPr>
-        <w:spacing w:before="20" w:after="40"/>
+        <w:spacing w:before="0" w:after="20"/>
       </w:pPr>
       <w:r>
         <w:rPr>
@@ -631,7 +561,7 @@
           <w:b/>
           <w:i w:val="0"/>
           <w:color w:val="007A87"/>
-          <w:sz w:val="20"/>
+          <w:sz w:val="18"/>
         </w:rPr>
         <w:t>write its reading in romaji</w:t>
       </w:r>
@@ -641,19 +571,9 @@
           <w:b w:val="0"/>
           <w:i w:val="0"/>
           <w:color w:val="1A1A2E"/>
-          <w:sz w:val="20"/>
+          <w:sz w:val="18"/>
         </w:rPr>
-        <w:t xml:space="preserve">. Write the sound from memory. </w:t>
-      </w:r>
-      <w:r>
-        <w:rPr>
-          <w:rFonts w:ascii="Calibri" w:hAnsi="Calibri"/>
-          <w:b/>
-          <w:i w:val="0"/>
-          <w:color w:val="E6A817"/>
-          <w:sz w:val="20"/>
-        </w:rPr>
-        <w:t xml:space="preserve">Example from another row: </w:t>
+        <w:t xml:space="preserve">. Example from another row: </w:t>
       </w:r>
       <w:r>
         <w:rPr>
@@ -661,29 +581,9 @@
           <w:b w:val="0"/>
           <w:i/>
           <w:color w:val="6B7B8D"/>
-          <w:sz w:val="20"/>
+          <w:sz w:val="18"/>
         </w:rPr>
-        <w:t xml:space="preserve">さ = sa. </w:t>
-      </w:r>
-      <w:r>
-        <w:rPr>
-          <w:rFonts w:ascii="Calibri" w:hAnsi="Calibri"/>
-          <w:b/>
-          <w:i w:val="0"/>
-          <w:color w:val="1A3A5C"/>
-          <w:sz w:val="20"/>
-        </w:rPr>
-        <w:t>Do not use the examples as answers</w:t>
-      </w:r>
-      <w:r>
-        <w:rPr>
-          <w:rFonts w:ascii="Calibri" w:hAnsi="Calibri"/>
-          <w:b w:val="0"/>
-          <w:i w:val="0"/>
-          <w:color w:val="1A1A2E"/>
-          <w:sz w:val="20"/>
-        </w:rPr>
-        <w:t xml:space="preserve"> because they only show how the activity works.</w:t>
+        <w:t>さ = sa.</w:t>
       </w:r>
     </w:p>
     <w:tbl>
@@ -706,7 +606,7 @@
           </w:tcPr>
           <w:p>
             <w:pPr>
-              <w:spacing w:before="40" w:after="40"/>
+              <w:spacing w:before="20" w:after="20"/>
               <w:jc w:val="center"/>
             </w:pPr>
             <w:r>
@@ -715,7 +615,7 @@
                 <w:b/>
                 <w:i w:val="0"/>
                 <w:color w:val="FFFFFF"/>
-                <w:sz w:val="20"/>
+                <w:sz w:val="18"/>
               </w:rPr>
               <w:t>#</w:t>
             </w:r>
@@ -729,7 +629,7 @@
           </w:tcPr>
           <w:p>
             <w:pPr>
-              <w:spacing w:before="40" w:after="40"/>
+              <w:spacing w:before="20" w:after="20"/>
               <w:jc w:val="center"/>
             </w:pPr>
             <w:r>
@@ -738,7 +638,7 @@
                 <w:b/>
                 <w:i w:val="0"/>
                 <w:color w:val="FFFFFF"/>
-                <w:sz w:val="20"/>
+                <w:sz w:val="18"/>
               </w:rPr>
               <w:t>Kana</w:t>
             </w:r>
@@ -752,7 +652,7 @@
           </w:tcPr>
           <w:p>
             <w:pPr>
-              <w:spacing w:before="40" w:after="40"/>
+              <w:spacing w:before="20" w:after="20"/>
               <w:jc w:val="center"/>
             </w:pPr>
             <w:r>
@@ -761,7 +661,7 @@
                 <w:b/>
                 <w:i w:val="0"/>
                 <w:color w:val="FFFFFF"/>
-                <w:sz w:val="20"/>
+                <w:sz w:val="18"/>
               </w:rPr>
               <w:t>Your reading</w:t>
             </w:r>
@@ -777,7 +677,7 @@
           </w:tcPr>
           <w:p>
             <w:pPr>
-              <w:spacing w:before="40" w:after="40"/>
+              <w:spacing w:before="20" w:after="20"/>
               <w:jc w:val="center"/>
             </w:pPr>
             <w:r>
@@ -800,7 +700,7 @@
           </w:tcPr>
           <w:p>
             <w:pPr>
-              <w:spacing w:before="40" w:after="40"/>
+              <w:spacing w:before="20" w:after="20"/>
               <w:jc w:val="center"/>
             </w:pPr>
             <w:r>
@@ -809,7 +709,7 @@
                 <w:b/>
                 <w:i w:val="0"/>
                 <w:color w:val="1A3A5C"/>
-                <w:sz w:val="28"/>
+                <w:sz w:val="26"/>
               </w:rPr>
               <w:t>あ</w:t>
             </w:r>
@@ -823,7 +723,7 @@
           </w:tcPr>
           <w:p>
             <w:pPr>
-              <w:spacing w:before="40" w:after="40"/>
+              <w:spacing w:before="20" w:after="20"/>
               <w:jc w:val="center"/>
             </w:pPr>
             <w:r>
@@ -832,7 +732,7 @@
                 <w:b w:val="0"/>
                 <w:i w:val="0"/>
                 <w:color w:val="1A1A2E"/>
-                <w:sz w:val="20"/>
+                <w:sz w:val="18"/>
               </w:rPr>
               <w:t>__________________</w:t>
             </w:r>
@@ -848,7 +748,7 @@
           </w:tcPr>
           <w:p>
             <w:pPr>
-              <w:spacing w:before="40" w:after="40"/>
+              <w:spacing w:before="20" w:after="20"/>
               <w:jc w:val="center"/>
             </w:pPr>
             <w:r>
@@ -871,7 +771,7 @@
           </w:tcPr>
           <w:p>
             <w:pPr>
-              <w:spacing w:before="40" w:after="40"/>
+              <w:spacing w:before="20" w:after="20"/>
               <w:jc w:val="center"/>
             </w:pPr>
             <w:r>
@@ -880,7 +780,7 @@
                 <w:b/>
                 <w:i w:val="0"/>
                 <w:color w:val="1A3A5C"/>
-                <w:sz w:val="28"/>
+                <w:sz w:val="26"/>
               </w:rPr>
               <w:t>い</w:t>
             </w:r>
@@ -894,7 +794,7 @@
           </w:tcPr>
           <w:p>
             <w:pPr>
-              <w:spacing w:before="40" w:after="40"/>
+              <w:spacing w:before="20" w:after="20"/>
               <w:jc w:val="center"/>
             </w:pPr>
             <w:r>
@@ -903,7 +803,7 @@
                 <w:b w:val="0"/>
                 <w:i w:val="0"/>
                 <w:color w:val="1A1A2E"/>
-                <w:sz w:val="20"/>
+                <w:sz w:val="18"/>
               </w:rPr>
               <w:t>__________________</w:t>
             </w:r>
@@ -919,7 +819,7 @@
           </w:tcPr>
           <w:p>
             <w:pPr>
-              <w:spacing w:before="40" w:after="40"/>
+              <w:spacing w:before="20" w:after="20"/>
               <w:jc w:val="center"/>
             </w:pPr>
             <w:r>
@@ -942,7 +842,7 @@
           </w:tcPr>
           <w:p>
             <w:pPr>
-              <w:spacing w:before="40" w:after="40"/>
+              <w:spacing w:before="20" w:after="20"/>
               <w:jc w:val="center"/>
             </w:pPr>
             <w:r>
@@ -951,7 +851,7 @@
                 <w:b/>
                 <w:i w:val="0"/>
                 <w:color w:val="1A3A5C"/>
-                <w:sz w:val="28"/>
+                <w:sz w:val="26"/>
               </w:rPr>
               <w:t>う</w:t>
             </w:r>
@@ -965,7 +865,7 @@
           </w:tcPr>
           <w:p>
             <w:pPr>
-              <w:spacing w:before="40" w:after="40"/>
+              <w:spacing w:before="20" w:after="20"/>
               <w:jc w:val="center"/>
             </w:pPr>
             <w:r>
@@ -974,7 +874,7 @@
                 <w:b w:val="0"/>
                 <w:i w:val="0"/>
                 <w:color w:val="1A1A2E"/>
-                <w:sz w:val="20"/>
+                <w:sz w:val="18"/>
               </w:rPr>
               <w:t>__________________</w:t>
             </w:r>
@@ -990,7 +890,7 @@
           </w:tcPr>
           <w:p>
             <w:pPr>
-              <w:spacing w:before="40" w:after="40"/>
+              <w:spacing w:before="20" w:after="20"/>
               <w:jc w:val="center"/>
             </w:pPr>
             <w:r>
@@ -1013,7 +913,7 @@
           </w:tcPr>
           <w:p>
             <w:pPr>
-              <w:spacing w:before="40" w:after="40"/>
+              <w:spacing w:before="20" w:after="20"/>
               <w:jc w:val="center"/>
             </w:pPr>
             <w:r>
@@ -1022,7 +922,7 @@
                 <w:b/>
                 <w:i w:val="0"/>
                 <w:color w:val="1A3A5C"/>
-                <w:sz w:val="28"/>
+                <w:sz w:val="26"/>
               </w:rPr>
               <w:t>え</w:t>
             </w:r>
@@ -1036,7 +936,7 @@
           </w:tcPr>
           <w:p>
             <w:pPr>
-              <w:spacing w:before="40" w:after="40"/>
+              <w:spacing w:before="20" w:after="20"/>
               <w:jc w:val="center"/>
             </w:pPr>
             <w:r>
@@ -1045,7 +945,7 @@
                 <w:b w:val="0"/>
                 <w:i w:val="0"/>
                 <w:color w:val="1A1A2E"/>
-                <w:sz w:val="20"/>
+                <w:sz w:val="18"/>
               </w:rPr>
               <w:t>__________________</w:t>
             </w:r>
@@ -1061,7 +961,7 @@
           </w:tcPr>
           <w:p>
             <w:pPr>
-              <w:spacing w:before="40" w:after="40"/>
+              <w:spacing w:before="20" w:after="20"/>
               <w:jc w:val="center"/>
             </w:pPr>
             <w:r>
@@ -1084,7 +984,7 @@
           </w:tcPr>
           <w:p>
             <w:pPr>
-              <w:spacing w:before="40" w:after="40"/>
+              <w:spacing w:before="20" w:after="20"/>
               <w:jc w:val="center"/>
             </w:pPr>
             <w:r>
@@ -1093,7 +993,7 @@
                 <w:b/>
                 <w:i w:val="0"/>
                 <w:color w:val="1A3A5C"/>
-                <w:sz w:val="28"/>
+                <w:sz w:val="26"/>
               </w:rPr>
               <w:t>お</w:t>
             </w:r>
@@ -1107,7 +1007,7 @@
           </w:tcPr>
           <w:p>
             <w:pPr>
-              <w:spacing w:before="40" w:after="40"/>
+              <w:spacing w:before="20" w:after="20"/>
               <w:jc w:val="center"/>
             </w:pPr>
             <w:r>
@@ -1116,7 +1016,7 @@
                 <w:b w:val="0"/>
                 <w:i w:val="0"/>
                 <w:color w:val="1A1A2E"/>
-                <w:sz w:val="20"/>
+                <w:sz w:val="18"/>
               </w:rPr>
               <w:t>__________________</w:t>
             </w:r>
@@ -1126,7 +1026,7 @@
     </w:tbl>
     <w:p>
       <w:pPr>
-        <w:spacing w:after="20"/>
+        <w:spacing w:after="0"/>
       </w:pPr>
     </w:p>
     <w:p>
@@ -1148,7 +1048,7 @@
     </w:p>
     <w:p>
       <w:pPr>
-        <w:spacing w:before="20" w:after="40"/>
+        <w:spacing w:before="0" w:after="20"/>
       </w:pPr>
       <w:r>
         <w:rPr>
@@ -1166,7 +1066,7 @@
           <w:b/>
           <w:i w:val="0"/>
           <w:color w:val="007A87"/>
-          <w:sz w:val="20"/>
+          <w:sz w:val="18"/>
         </w:rPr>
         <w:t>Fill in the missing kana</w:t>
       </w:r>
@@ -1186,7 +1086,7 @@
           <w:b/>
           <w:i w:val="0"/>
           <w:color w:val="1A3A5C"/>
-          <w:sz w:val="20"/>
+          <w:sz w:val="18"/>
         </w:rPr>
         <w:t>circle the one that does not belong</w:t>
       </w:r>
@@ -1220,7 +1120,7 @@
           </w:tcPr>
           <w:p>
             <w:pPr>
-              <w:spacing w:before="40" w:after="40"/>
+              <w:spacing w:before="20" w:after="20"/>
               <w:jc w:val="center"/>
             </w:pPr>
             <w:r>
@@ -1229,7 +1129,7 @@
                 <w:b/>
                 <w:i w:val="0"/>
                 <w:color w:val="FFFFFF"/>
-                <w:sz w:val="20"/>
+                <w:sz w:val="18"/>
               </w:rPr>
               <w:t>Fill in the missing kana</w:t>
             </w:r>
@@ -1243,7 +1143,7 @@
           </w:tcPr>
           <w:p>
             <w:pPr>
-              <w:spacing w:before="40" w:after="40"/>
+              <w:spacing w:before="20" w:after="20"/>
               <w:jc w:val="center"/>
             </w:pPr>
             <w:r>
@@ -1252,7 +1152,7 @@
                 <w:b/>
                 <w:i w:val="0"/>
                 <w:color w:val="FFFFFF"/>
-                <w:sz w:val="20"/>
+                <w:sz w:val="18"/>
               </w:rPr>
               <w:t>Your answer</w:t>
             </w:r>
@@ -1268,7 +1168,7 @@
           </w:tcPr>
           <w:p>
             <w:pPr>
-              <w:spacing w:before="40" w:after="40"/>
+              <w:spacing w:before="20" w:after="20"/>
               <w:jc w:val="center"/>
             </w:pPr>
             <w:r>
@@ -1277,7 +1177,7 @@
                 <w:b/>
                 <w:i w:val="0"/>
                 <w:color w:val="1A3A5C"/>
-                <w:sz w:val="24"/>
+                <w:sz w:val="22"/>
               </w:rPr>
               <w:t>あ  __  う  __  お</w:t>
             </w:r>
@@ -1291,7 +1191,7 @@
           </w:tcPr>
           <w:p>
             <w:pPr>
-              <w:spacing w:before="40" w:after="40"/>
+              <w:spacing w:before="20" w:after="20"/>
               <w:jc w:val="center"/>
             </w:pPr>
             <w:r>
@@ -1300,55 +1200,7 @@
                 <w:b w:val="0"/>
                 <w:i w:val="0"/>
                 <w:color w:val="1A1A2E"/>
-                <w:sz w:val="20"/>
-              </w:rPr>
-              <w:t>__________________</w:t>
-            </w:r>
-          </w:p>
-        </w:tc>
-      </w:tr>
-      <w:tr>
-        <w:tc>
-          <w:tcPr>
-            <w:tcW w:type="dxa" w:w="5832"/>
-            <w:shd w:val="clear" w:color="auto" w:fill="FFFFFF"/>
-            <w:vAlign w:val="center"/>
-          </w:tcPr>
-          <w:p>
-            <w:pPr>
-              <w:spacing w:before="40" w:after="40"/>
-              <w:jc w:val="center"/>
-            </w:pPr>
-            <w:r>
-              <w:rPr>
-                <w:rFonts w:ascii="Calibri" w:hAnsi="Calibri"/>
-                <w:b/>
-                <w:i w:val="0"/>
-                <w:color w:val="1A3A5C"/>
-                <w:sz w:val="24"/>
-              </w:rPr>
-              <w:t>__  い  __  え  __</w:t>
-            </w:r>
-          </w:p>
-        </w:tc>
-        <w:tc>
-          <w:tcPr>
-            <w:tcW w:type="dxa" w:w="5832"/>
-            <w:shd w:val="clear" w:color="auto" w:fill="FFFFFF"/>
-            <w:vAlign w:val="center"/>
-          </w:tcPr>
-          <w:p>
-            <w:pPr>
-              <w:spacing w:before="40" w:after="40"/>
-              <w:jc w:val="center"/>
-            </w:pPr>
-            <w:r>
-              <w:rPr>
-                <w:rFonts w:ascii="Calibri" w:hAnsi="Calibri"/>
-                <w:b w:val="0"/>
-                <w:i w:val="0"/>
-                <w:color w:val="1A1A2E"/>
-                <w:sz w:val="20"/>
+                <w:sz w:val="18"/>
               </w:rPr>
               <w:t>__________________</w:t>
             </w:r>
@@ -1375,7 +1227,7 @@
           </w:tcPr>
           <w:p>
             <w:pPr>
-              <w:spacing w:before="40" w:after="40"/>
+              <w:spacing w:before="20" w:after="20"/>
               <w:jc w:val="center"/>
             </w:pPr>
             <w:r>
@@ -1384,7 +1236,7 @@
                 <w:b/>
                 <w:i w:val="0"/>
                 <w:color w:val="FFFFFF"/>
-                <w:sz w:val="20"/>
+                <w:sz w:val="18"/>
               </w:rPr>
               <w:t>Circle the kana that does not belong</w:t>
             </w:r>
@@ -1398,7 +1250,7 @@
           </w:tcPr>
           <w:p>
             <w:pPr>
-              <w:spacing w:before="40" w:after="40"/>
+              <w:spacing w:before="20" w:after="20"/>
               <w:jc w:val="center"/>
             </w:pPr>
             <w:r>
@@ -1407,7 +1259,7 @@
                 <w:b/>
                 <w:i w:val="0"/>
                 <w:color w:val="FFFFFF"/>
-                <w:sz w:val="20"/>
+                <w:sz w:val="18"/>
               </w:rPr>
               <w:t>Your answer</w:t>
             </w:r>
@@ -1423,7 +1275,7 @@
           </w:tcPr>
           <w:p>
             <w:pPr>
-              <w:spacing w:before="40" w:after="40"/>
+              <w:spacing w:before="20" w:after="20"/>
               <w:jc w:val="center"/>
             </w:pPr>
             <w:r>
@@ -1432,7 +1284,7 @@
                 <w:b/>
                 <w:i w:val="0"/>
                 <w:color w:val="1A3A5C"/>
-                <w:sz w:val="24"/>
+                <w:sz w:val="22"/>
               </w:rPr>
               <w:t>か   あ   い   う</w:t>
             </w:r>
@@ -1446,7 +1298,7 @@
           </w:tcPr>
           <w:p>
             <w:pPr>
-              <w:spacing w:before="40" w:after="40"/>
+              <w:spacing w:before="20" w:after="20"/>
               <w:jc w:val="center"/>
             </w:pPr>
             <w:r>
@@ -1455,7 +1307,7 @@
                 <w:b w:val="0"/>
                 <w:i w:val="0"/>
                 <w:color w:val="1A1A2E"/>
-                <w:sz w:val="20"/>
+                <w:sz w:val="18"/>
               </w:rPr>
               <w:t>________</w:t>
             </w:r>
@@ -1471,7 +1323,7 @@
           </w:tcPr>
           <w:p>
             <w:pPr>
-              <w:spacing w:before="40" w:after="40"/>
+              <w:spacing w:before="20" w:after="20"/>
               <w:jc w:val="center"/>
             </w:pPr>
             <w:r>
@@ -1480,7 +1332,7 @@
                 <w:b/>
                 <w:i w:val="0"/>
                 <w:color w:val="1A3A5C"/>
-                <w:sz w:val="24"/>
+                <w:sz w:val="22"/>
               </w:rPr>
               <w:t>い   き   う   え</w:t>
             </w:r>
@@ -1494,7 +1346,7 @@
           </w:tcPr>
           <w:p>
             <w:pPr>
-              <w:spacing w:before="40" w:after="40"/>
+              <w:spacing w:before="20" w:after="20"/>
               <w:jc w:val="center"/>
             </w:pPr>
             <w:r>
@@ -1503,55 +1355,7 @@
                 <w:b w:val="0"/>
                 <w:i w:val="0"/>
                 <w:color w:val="1A1A2E"/>
-                <w:sz w:val="20"/>
-              </w:rPr>
-              <w:t>________</w:t>
-            </w:r>
-          </w:p>
-        </w:tc>
-      </w:tr>
-      <w:tr>
-        <w:tc>
-          <w:tcPr>
-            <w:tcW w:type="dxa" w:w="5832"/>
-            <w:shd w:val="clear" w:color="auto" w:fill="D4F1F4"/>
-            <w:vAlign w:val="center"/>
-          </w:tcPr>
-          <w:p>
-            <w:pPr>
-              <w:spacing w:before="40" w:after="40"/>
-              <w:jc w:val="center"/>
-            </w:pPr>
-            <w:r>
-              <w:rPr>
-                <w:rFonts w:ascii="Calibri" w:hAnsi="Calibri"/>
-                <w:b/>
-                <w:i w:val="0"/>
-                <w:color w:val="1A3A5C"/>
-                <w:sz w:val="24"/>
-              </w:rPr>
-              <w:t>う   え   く   お</w:t>
-            </w:r>
-          </w:p>
-        </w:tc>
-        <w:tc>
-          <w:tcPr>
-            <w:tcW w:type="dxa" w:w="5832"/>
-            <w:shd w:val="clear" w:color="auto" w:fill="D4F1F4"/>
-            <w:vAlign w:val="center"/>
-          </w:tcPr>
-          <w:p>
-            <w:pPr>
-              <w:spacing w:before="40" w:after="40"/>
-              <w:jc w:val="center"/>
-            </w:pPr>
-            <w:r>
-              <w:rPr>
-                <w:rFonts w:ascii="Calibri" w:hAnsi="Calibri"/>
-                <w:b w:val="0"/>
-                <w:i w:val="0"/>
-                <w:color w:val="1A1A2E"/>
-                <w:sz w:val="20"/>
+                <w:sz w:val="18"/>
               </w:rPr>
               <w:t>________</w:t>
             </w:r>
@@ -1602,7 +1406,7 @@
     </w:p>
     <w:p>
       <w:pPr>
-        <w:spacing w:before="20" w:after="40"/>
+        <w:spacing w:before="0" w:after="20"/>
       </w:pPr>
       <w:r>
         <w:rPr>
@@ -1610,9 +1414,9 @@
           <w:b w:val="0"/>
           <w:i w:val="0"/>
           <w:color w:val="1A1A2E"/>
-          <w:sz w:val="20"/>
+          <w:sz w:val="18"/>
         </w:rPr>
-        <w:t>Use this page as a reference after students finish page 1. Read each kana left to right and treat each one as one clean sound beat.</w:t>
+        <w:t>Use this page as a reference after students finish page 1.</w:t>
       </w:r>
     </w:p>
     <w:tbl>
@@ -1634,7 +1438,7 @@
           </w:tcPr>
           <w:p>
             <w:pPr>
-              <w:spacing w:before="40" w:after="40"/>
+              <w:spacing w:before="20" w:after="20"/>
               <w:jc w:val="center"/>
             </w:pPr>
             <w:r>
@@ -1643,7 +1447,7 @@
                 <w:b/>
                 <w:i w:val="0"/>
                 <w:color w:val="FFFFFF"/>
-                <w:sz w:val="20"/>
+                <w:sz w:val="18"/>
               </w:rPr>
               <w:t>Practice pair</w:t>
             </w:r>
@@ -1657,7 +1461,7 @@
           </w:tcPr>
           <w:p>
             <w:pPr>
-              <w:spacing w:before="40" w:after="40"/>
+              <w:spacing w:before="20" w:after="20"/>
               <w:jc w:val="center"/>
             </w:pPr>
             <w:r>
@@ -1666,7 +1470,7 @@
                 <w:b/>
                 <w:i w:val="0"/>
                 <w:color w:val="FFFFFF"/>
-                <w:sz w:val="20"/>
+                <w:sz w:val="18"/>
               </w:rPr>
               <w:t>Reading</w:t>
             </w:r>
@@ -1682,7 +1486,7 @@
           </w:tcPr>
           <w:p>
             <w:pPr>
-              <w:spacing w:before="40" w:after="40"/>
+              <w:spacing w:before="20" w:after="20"/>
               <w:jc w:val="center"/>
             </w:pPr>
             <w:r>
@@ -1705,7 +1509,7 @@
           </w:tcPr>
           <w:p>
             <w:pPr>
-              <w:spacing w:before="40" w:after="40"/>
+              <w:spacing w:before="20" w:after="20"/>
               <w:jc w:val="center"/>
             </w:pPr>
             <w:r>
@@ -1714,7 +1518,7 @@
                 <w:b w:val="0"/>
                 <w:i w:val="0"/>
                 <w:color w:val="1A1A2E"/>
-                <w:sz w:val="20"/>
+                <w:sz w:val="18"/>
               </w:rPr>
               <w:t>a-i</w:t>
             </w:r>
@@ -1730,7 +1534,7 @@
           </w:tcPr>
           <w:p>
             <w:pPr>
-              <w:spacing w:before="40" w:after="40"/>
+              <w:spacing w:before="20" w:after="20"/>
               <w:jc w:val="center"/>
             </w:pPr>
             <w:r>
@@ -1753,7 +1557,7 @@
           </w:tcPr>
           <w:p>
             <w:pPr>
-              <w:spacing w:before="40" w:after="40"/>
+              <w:spacing w:before="20" w:after="20"/>
               <w:jc w:val="center"/>
             </w:pPr>
             <w:r>
@@ -1762,7 +1566,7 @@
                 <w:b w:val="0"/>
                 <w:i w:val="0"/>
                 <w:color w:val="1A1A2E"/>
-                <w:sz w:val="20"/>
+                <w:sz w:val="18"/>
               </w:rPr>
               <w:t>u-e</w:t>
             </w:r>
@@ -1773,102 +1577,34 @@
         <w:tc>
           <w:tcPr>
             <w:tcW w:type="dxa" w:w="5832"/>
-            <w:shd w:val="clear" w:color="auto" w:fill="F0F6FA"/>
-            <w:vAlign w:val="center"/>
           </w:tcPr>
-          <w:p>
-            <w:pPr>
-              <w:spacing w:before="40" w:after="40"/>
-              <w:jc w:val="center"/>
-            </w:pPr>
-            <w:r>
-              <w:rPr>
-                <w:rFonts w:ascii="Calibri" w:hAnsi="Calibri"/>
-                <w:b/>
-                <w:i w:val="0"/>
-                <w:color w:val="1A3A5C"/>
-                <w:sz w:val="24"/>
-              </w:rPr>
-              <w:t>あお</w:t>
-            </w:r>
-          </w:p>
+          <w:p/>
         </w:tc>
         <w:tc>
           <w:tcPr>
             <w:tcW w:type="dxa" w:w="5832"/>
-            <w:shd w:val="clear" w:color="auto" w:fill="F0F6FA"/>
-            <w:vAlign w:val="center"/>
           </w:tcPr>
-          <w:p>
-            <w:pPr>
-              <w:spacing w:before="40" w:after="40"/>
-              <w:jc w:val="center"/>
-            </w:pPr>
-            <w:r>
-              <w:rPr>
-                <w:rFonts w:ascii="Calibri" w:hAnsi="Calibri"/>
-                <w:b w:val="0"/>
-                <w:i w:val="0"/>
-                <w:color w:val="1A1A2E"/>
-                <w:sz w:val="20"/>
-              </w:rPr>
-              <w:t>a-o</w:t>
-            </w:r>
-          </w:p>
+          <w:p/>
         </w:tc>
       </w:tr>
       <w:tr>
         <w:tc>
           <w:tcPr>
             <w:tcW w:type="dxa" w:w="5832"/>
-            <w:shd w:val="clear" w:color="auto" w:fill="FFFFFF"/>
-            <w:vAlign w:val="center"/>
           </w:tcPr>
-          <w:p>
-            <w:pPr>
-              <w:spacing w:before="40" w:after="40"/>
-              <w:jc w:val="center"/>
-            </w:pPr>
-            <w:r>
-              <w:rPr>
-                <w:rFonts w:ascii="Calibri" w:hAnsi="Calibri"/>
-                <w:b/>
-                <w:i w:val="0"/>
-                <w:color w:val="1A3A5C"/>
-                <w:sz w:val="24"/>
-              </w:rPr>
-              <w:t>いえ</w:t>
-            </w:r>
-          </w:p>
+          <w:p/>
         </w:tc>
         <w:tc>
           <w:tcPr>
             <w:tcW w:type="dxa" w:w="5832"/>
-            <w:shd w:val="clear" w:color="auto" w:fill="FFFFFF"/>
-            <w:vAlign w:val="center"/>
           </w:tcPr>
-          <w:p>
-            <w:pPr>
-              <w:spacing w:before="40" w:after="40"/>
-              <w:jc w:val="center"/>
-            </w:pPr>
-            <w:r>
-              <w:rPr>
-                <w:rFonts w:ascii="Calibri" w:hAnsi="Calibri"/>
-                <w:b w:val="0"/>
-                <w:i w:val="0"/>
-                <w:color w:val="1A1A2E"/>
-                <w:sz w:val="20"/>
-              </w:rPr>
-              <w:t>i-e</w:t>
-            </w:r>
-          </w:p>
+          <w:p/>
         </w:tc>
       </w:tr>
     </w:tbl>
     <w:p>
       <w:pPr>
-        <w:spacing w:after="20"/>
+        <w:spacing w:after="0"/>
       </w:pPr>
     </w:p>
     <w:p>
@@ -1907,7 +1643,7 @@
           </w:tcPr>
           <w:p>
             <w:pPr>
-              <w:spacing w:before="40" w:after="40"/>
+              <w:spacing w:before="20" w:after="20"/>
               <w:jc w:val="center"/>
             </w:pPr>
             <w:r>
@@ -1916,7 +1652,7 @@
                 <w:b/>
                 <w:i w:val="0"/>
                 <w:color w:val="FFFFFF"/>
-                <w:sz w:val="20"/>
+                <w:sz w:val="18"/>
               </w:rPr>
               <w:t>Kana</w:t>
             </w:r>
@@ -1930,7 +1666,7 @@
           </w:tcPr>
           <w:p>
             <w:pPr>
-              <w:spacing w:before="40" w:after="40"/>
+              <w:spacing w:before="20" w:after="20"/>
               <w:jc w:val="center"/>
             </w:pPr>
             <w:r>
@@ -1939,7 +1675,7 @@
                 <w:b/>
                 <w:i w:val="0"/>
                 <w:color w:val="FFFFFF"/>
-                <w:sz w:val="20"/>
+                <w:sz w:val="18"/>
               </w:rPr>
               <w:t>Reading</w:t>
             </w:r>
@@ -1955,7 +1691,7 @@
           </w:tcPr>
           <w:p>
             <w:pPr>
-              <w:spacing w:before="40" w:after="40"/>
+              <w:spacing w:before="20" w:after="20"/>
               <w:jc w:val="center"/>
             </w:pPr>
             <w:r>
@@ -1964,7 +1700,7 @@
                 <w:b/>
                 <w:i w:val="0"/>
                 <w:color w:val="1A3A5C"/>
-                <w:sz w:val="26"/>
+                <w:sz w:val="24"/>
               </w:rPr>
               <w:t>あ</w:t>
             </w:r>
@@ -1978,7 +1714,7 @@
           </w:tcPr>
           <w:p>
             <w:pPr>
-              <w:spacing w:before="40" w:after="40"/>
+              <w:spacing w:before="20" w:after="20"/>
               <w:jc w:val="center"/>
             </w:pPr>
             <w:r>
@@ -1987,7 +1723,7 @@
                 <w:b w:val="0"/>
                 <w:i w:val="0"/>
                 <w:color w:val="1A1A2E"/>
-                <w:sz w:val="20"/>
+                <w:sz w:val="18"/>
               </w:rPr>
               <w:t>a</w:t>
             </w:r>
@@ -2003,7 +1739,7 @@
           </w:tcPr>
           <w:p>
             <w:pPr>
-              <w:spacing w:before="40" w:after="40"/>
+              <w:spacing w:before="20" w:after="20"/>
               <w:jc w:val="center"/>
             </w:pPr>
             <w:r>
@@ -2012,7 +1748,7 @@
                 <w:b/>
                 <w:i w:val="0"/>
                 <w:color w:val="1A3A5C"/>
-                <w:sz w:val="26"/>
+                <w:sz w:val="24"/>
               </w:rPr>
               <w:t>い</w:t>
             </w:r>
@@ -2026,7 +1762,7 @@
           </w:tcPr>
           <w:p>
             <w:pPr>
-              <w:spacing w:before="40" w:after="40"/>
+              <w:spacing w:before="20" w:after="20"/>
               <w:jc w:val="center"/>
             </w:pPr>
             <w:r>
@@ -2035,7 +1771,7 @@
                 <w:b w:val="0"/>
                 <w:i w:val="0"/>
                 <w:color w:val="1A1A2E"/>
-                <w:sz w:val="20"/>
+                <w:sz w:val="18"/>
               </w:rPr>
               <w:t>i</w:t>
             </w:r>
@@ -2051,7 +1787,7 @@
           </w:tcPr>
           <w:p>
             <w:pPr>
-              <w:spacing w:before="40" w:after="40"/>
+              <w:spacing w:before="20" w:after="20"/>
               <w:jc w:val="center"/>
             </w:pPr>
             <w:r>
@@ -2060,7 +1796,7 @@
                 <w:b/>
                 <w:i w:val="0"/>
                 <w:color w:val="1A3A5C"/>
-                <w:sz w:val="26"/>
+                <w:sz w:val="24"/>
               </w:rPr>
               <w:t>う</w:t>
             </w:r>
@@ -2074,7 +1810,7 @@
           </w:tcPr>
           <w:p>
             <w:pPr>
-              <w:spacing w:before="40" w:after="40"/>
+              <w:spacing w:before="20" w:after="20"/>
               <w:jc w:val="center"/>
             </w:pPr>
             <w:r>
@@ -2083,7 +1819,7 @@
                 <w:b w:val="0"/>
                 <w:i w:val="0"/>
                 <w:color w:val="1A1A2E"/>
-                <w:sz w:val="20"/>
+                <w:sz w:val="18"/>
               </w:rPr>
               <w:t>u</w:t>
             </w:r>
@@ -2099,7 +1835,7 @@
           </w:tcPr>
           <w:p>
             <w:pPr>
-              <w:spacing w:before="40" w:after="40"/>
+              <w:spacing w:before="20" w:after="20"/>
               <w:jc w:val="center"/>
             </w:pPr>
             <w:r>
@@ -2108,7 +1844,7 @@
                 <w:b/>
                 <w:i w:val="0"/>
                 <w:color w:val="1A3A5C"/>
-                <w:sz w:val="26"/>
+                <w:sz w:val="24"/>
               </w:rPr>
               <w:t>え</w:t>
             </w:r>
@@ -2122,7 +1858,7 @@
           </w:tcPr>
           <w:p>
             <w:pPr>
-              <w:spacing w:before="40" w:after="40"/>
+              <w:spacing w:before="20" w:after="20"/>
               <w:jc w:val="center"/>
             </w:pPr>
             <w:r>
@@ -2131,7 +1867,7 @@
                 <w:b w:val="0"/>
                 <w:i w:val="0"/>
                 <w:color w:val="1A1A2E"/>
-                <w:sz w:val="20"/>
+                <w:sz w:val="18"/>
               </w:rPr>
               <w:t>e</w:t>
             </w:r>
@@ -2147,7 +1883,7 @@
           </w:tcPr>
           <w:p>
             <w:pPr>
-              <w:spacing w:before="40" w:after="40"/>
+              <w:spacing w:before="20" w:after="20"/>
               <w:jc w:val="center"/>
             </w:pPr>
             <w:r>
@@ -2156,7 +1892,7 @@
                 <w:b/>
                 <w:i w:val="0"/>
                 <w:color w:val="1A3A5C"/>
-                <w:sz w:val="26"/>
+                <w:sz w:val="24"/>
               </w:rPr>
               <w:t>お</w:t>
             </w:r>
@@ -2170,7 +1906,7 @@
           </w:tcPr>
           <w:p>
             <w:pPr>
-              <w:spacing w:before="40" w:after="40"/>
+              <w:spacing w:before="20" w:after="20"/>
               <w:jc w:val="center"/>
             </w:pPr>
             <w:r>
@@ -2179,7 +1915,7 @@
                 <w:b w:val="0"/>
                 <w:i w:val="0"/>
                 <w:color w:val="1A1A2E"/>
-                <w:sz w:val="20"/>
+                <w:sz w:val="18"/>
               </w:rPr>
               <w:t>o</w:t>
             </w:r>
@@ -2189,7 +1925,7 @@
     </w:tbl>
     <w:p>
       <w:pPr>
-        <w:spacing w:after="20"/>
+        <w:spacing w:after="0"/>
       </w:pPr>
     </w:p>
     <w:p>
@@ -2228,7 +1964,7 @@
           </w:tcPr>
           <w:p>
             <w:pPr>
-              <w:spacing w:before="40" w:after="40"/>
+              <w:spacing w:before="20" w:after="20"/>
               <w:jc w:val="center"/>
             </w:pPr>
             <w:r>
@@ -2237,7 +1973,7 @@
                 <w:b/>
                 <w:i w:val="0"/>
                 <w:color w:val="FFFFFF"/>
-                <w:sz w:val="20"/>
+                <w:sz w:val="18"/>
               </w:rPr>
               <w:t>Fill in the missing kana</w:t>
             </w:r>
@@ -2251,7 +1987,7 @@
           </w:tcPr>
           <w:p>
             <w:pPr>
-              <w:spacing w:before="40" w:after="40"/>
+              <w:spacing w:before="20" w:after="20"/>
               <w:jc w:val="center"/>
             </w:pPr>
             <w:r>
@@ -2260,7 +1996,7 @@
                 <w:b/>
                 <w:i w:val="0"/>
                 <w:color w:val="FFFFFF"/>
-                <w:sz w:val="20"/>
+                <w:sz w:val="18"/>
               </w:rPr>
               <w:t>Answer</w:t>
             </w:r>
@@ -2276,7 +2012,7 @@
           </w:tcPr>
           <w:p>
             <w:pPr>
-              <w:spacing w:before="40" w:after="40"/>
+              <w:spacing w:before="20" w:after="20"/>
               <w:jc w:val="center"/>
             </w:pPr>
             <w:r>
@@ -2285,7 +2021,7 @@
                 <w:b/>
                 <w:i w:val="0"/>
                 <w:color w:val="1A3A5C"/>
-                <w:sz w:val="22"/>
+                <w:sz w:val="20"/>
               </w:rPr>
               <w:t>あ  __  う  __  お</w:t>
             </w:r>
@@ -2299,7 +2035,7 @@
           </w:tcPr>
           <w:p>
             <w:pPr>
-              <w:spacing w:before="40" w:after="40"/>
+              <w:spacing w:before="20" w:after="20"/>
               <w:jc w:val="center"/>
             </w:pPr>
             <w:r>
@@ -2308,57 +2044,9 @@
                 <w:b w:val="0"/>
                 <w:i w:val="0"/>
                 <w:color w:val="1A1A2E"/>
-                <w:sz w:val="20"/>
+                <w:sz w:val="18"/>
               </w:rPr>
               <w:t>い, え</w:t>
-            </w:r>
-          </w:p>
-        </w:tc>
-      </w:tr>
-      <w:tr>
-        <w:tc>
-          <w:tcPr>
-            <w:tcW w:type="dxa" w:w="5832"/>
-            <w:shd w:val="clear" w:color="auto" w:fill="FFFFFF"/>
-            <w:vAlign w:val="center"/>
-          </w:tcPr>
-          <w:p>
-            <w:pPr>
-              <w:spacing w:before="40" w:after="40"/>
-              <w:jc w:val="center"/>
-            </w:pPr>
-            <w:r>
-              <w:rPr>
-                <w:rFonts w:ascii="Calibri" w:hAnsi="Calibri"/>
-                <w:b/>
-                <w:i w:val="0"/>
-                <w:color w:val="1A3A5C"/>
-                <w:sz w:val="22"/>
-              </w:rPr>
-              <w:t>__  い  __  え  __</w:t>
-            </w:r>
-          </w:p>
-        </w:tc>
-        <w:tc>
-          <w:tcPr>
-            <w:tcW w:type="dxa" w:w="5832"/>
-            <w:shd w:val="clear" w:color="auto" w:fill="FFFFFF"/>
-            <w:vAlign w:val="center"/>
-          </w:tcPr>
-          <w:p>
-            <w:pPr>
-              <w:spacing w:before="40" w:after="40"/>
-              <w:jc w:val="center"/>
-            </w:pPr>
-            <w:r>
-              <w:rPr>
-                <w:rFonts w:ascii="Calibri" w:hAnsi="Calibri"/>
-                <w:b w:val="0"/>
-                <w:i w:val="0"/>
-                <w:color w:val="1A1A2E"/>
-                <w:sz w:val="20"/>
-              </w:rPr>
-              <w:t>あ, う, お</w:t>
             </w:r>
           </w:p>
         </w:tc>
@@ -2383,7 +2071,7 @@
           </w:tcPr>
           <w:p>
             <w:pPr>
-              <w:spacing w:before="40" w:after="40"/>
+              <w:spacing w:before="20" w:after="20"/>
               <w:jc w:val="center"/>
             </w:pPr>
             <w:r>
@@ -2392,7 +2080,7 @@
                 <w:b/>
                 <w:i w:val="0"/>
                 <w:color w:val="FFFFFF"/>
-                <w:sz w:val="20"/>
+                <w:sz w:val="18"/>
               </w:rPr>
               <w:t>Circle the kana that does not belong</w:t>
             </w:r>
@@ -2406,7 +2094,7 @@
           </w:tcPr>
           <w:p>
             <w:pPr>
-              <w:spacing w:before="40" w:after="40"/>
+              <w:spacing w:before="20" w:after="20"/>
               <w:jc w:val="center"/>
             </w:pPr>
             <w:r>
@@ -2415,7 +2103,7 @@
                 <w:b/>
                 <w:i w:val="0"/>
                 <w:color w:val="FFFFFF"/>
-                <w:sz w:val="20"/>
+                <w:sz w:val="18"/>
               </w:rPr>
               <w:t>Answer</w:t>
             </w:r>
@@ -2431,7 +2119,7 @@
           </w:tcPr>
           <w:p>
             <w:pPr>
-              <w:spacing w:before="40" w:after="40"/>
+              <w:spacing w:before="20" w:after="20"/>
               <w:jc w:val="center"/>
             </w:pPr>
             <w:r>
@@ -2440,7 +2128,7 @@
                 <w:b/>
                 <w:i w:val="0"/>
                 <w:color w:val="1A3A5C"/>
-                <w:sz w:val="22"/>
+                <w:sz w:val="20"/>
               </w:rPr>
               <w:t>か   あ   い   う</w:t>
             </w:r>
@@ -2454,7 +2142,7 @@
           </w:tcPr>
           <w:p>
             <w:pPr>
-              <w:spacing w:before="40" w:after="40"/>
+              <w:spacing w:before="20" w:after="20"/>
               <w:jc w:val="center"/>
             </w:pPr>
             <w:r>
@@ -2463,7 +2151,7 @@
                 <w:b w:val="0"/>
                 <w:i w:val="0"/>
                 <w:color w:val="1A1A2E"/>
-                <w:sz w:val="20"/>
+                <w:sz w:val="18"/>
               </w:rPr>
               <w:t>か</w:t>
             </w:r>
@@ -2479,7 +2167,7 @@
           </w:tcPr>
           <w:p>
             <w:pPr>
-              <w:spacing w:before="40" w:after="40"/>
+              <w:spacing w:before="20" w:after="20"/>
               <w:jc w:val="center"/>
             </w:pPr>
             <w:r>
@@ -2488,7 +2176,7 @@
                 <w:b/>
                 <w:i w:val="0"/>
                 <w:color w:val="1A3A5C"/>
-                <w:sz w:val="22"/>
+                <w:sz w:val="20"/>
               </w:rPr>
               <w:t>い   き   う   え</w:t>
             </w:r>
@@ -2502,7 +2190,7 @@
           </w:tcPr>
           <w:p>
             <w:pPr>
-              <w:spacing w:before="40" w:after="40"/>
+              <w:spacing w:before="20" w:after="20"/>
               <w:jc w:val="center"/>
             </w:pPr>
             <w:r>
@@ -2511,57 +2199,9 @@
                 <w:b w:val="0"/>
                 <w:i w:val="0"/>
                 <w:color w:val="1A1A2E"/>
-                <w:sz w:val="20"/>
+                <w:sz w:val="18"/>
               </w:rPr>
               <w:t>き</w:t>
-            </w:r>
-          </w:p>
-        </w:tc>
-      </w:tr>
-      <w:tr>
-        <w:tc>
-          <w:tcPr>
-            <w:tcW w:type="dxa" w:w="5832"/>
-            <w:shd w:val="clear" w:color="auto" w:fill="D4F1F4"/>
-            <w:vAlign w:val="center"/>
-          </w:tcPr>
-          <w:p>
-            <w:pPr>
-              <w:spacing w:before="40" w:after="40"/>
-              <w:jc w:val="center"/>
-            </w:pPr>
-            <w:r>
-              <w:rPr>
-                <w:rFonts w:ascii="Calibri" w:hAnsi="Calibri"/>
-                <w:b/>
-                <w:i w:val="0"/>
-                <w:color w:val="1A3A5C"/>
-                <w:sz w:val="22"/>
-              </w:rPr>
-              <w:t>う   え   く   お</w:t>
-            </w:r>
-          </w:p>
-        </w:tc>
-        <w:tc>
-          <w:tcPr>
-            <w:tcW w:type="dxa" w:w="5832"/>
-            <w:shd w:val="clear" w:color="auto" w:fill="D4F1F4"/>
-            <w:vAlign w:val="center"/>
-          </w:tcPr>
-          <w:p>
-            <w:pPr>
-              <w:spacing w:before="40" w:after="40"/>
-              <w:jc w:val="center"/>
-            </w:pPr>
-            <w:r>
-              <w:rPr>
-                <w:rFonts w:ascii="Calibri" w:hAnsi="Calibri"/>
-                <w:b w:val="0"/>
-                <w:i w:val="0"/>
-                <w:color w:val="1A1A2E"/>
-                <w:sz w:val="20"/>
-              </w:rPr>
-              <w:t>く</w:t>
             </w:r>
           </w:p>
         </w:tc>
@@ -2569,7 +2209,7 @@
     </w:tbl>
     <w:p>
       <w:pPr>
-        <w:spacing w:after="20"/>
+        <w:spacing w:after="0"/>
       </w:pPr>
     </w:p>
     <w:p>
@@ -2584,12 +2224,12 @@
           <w:color w:val="007A87"/>
           <w:sz w:val="24"/>
         </w:rPr>
-        <w:t>Important reminders</w:t>
+        <w:t>Quick review</w:t>
       </w:r>
     </w:p>
     <w:p>
       <w:pPr>
-        <w:spacing w:before="0" w:after="20"/>
+        <w:spacing w:before="0" w:after="0"/>
         <w:ind w:left="340"/>
       </w:pPr>
       <w:r>
@@ -2598,7 +2238,7 @@
           <w:b/>
           <w:i w:val="0"/>
           <w:color w:val="E6A817"/>
-          <w:sz w:val="20"/>
+          <w:sz w:val="18"/>
         </w:rPr>
         <w:t xml:space="preserve">▸ </w:t>
       </w:r>
@@ -2608,14 +2248,14 @@
           <w:b w:val="0"/>
           <w:i w:val="0"/>
           <w:color w:val="1A1A2E"/>
-          <w:sz w:val="20"/>
+          <w:sz w:val="18"/>
         </w:rPr>
         <w:t>One hiragana usually represents one sound beat.</w:t>
       </w:r>
     </w:p>
     <w:p>
       <w:pPr>
-        <w:spacing w:before="0" w:after="20"/>
+        <w:spacing w:before="0" w:after="0"/>
         <w:ind w:left="340"/>
       </w:pPr>
       <w:r>
@@ -2624,7 +2264,7 @@
           <w:b/>
           <w:i w:val="0"/>
           <w:color w:val="E6A817"/>
-          <w:sz w:val="20"/>
+          <w:sz w:val="18"/>
         </w:rPr>
         <w:t xml:space="preserve">▸ </w:t>
       </w:r>
@@ -2634,14 +2274,14 @@
           <w:b w:val="0"/>
           <w:i w:val="0"/>
           <w:color w:val="1A1A2E"/>
-          <w:sz w:val="20"/>
+          <w:sz w:val="18"/>
         </w:rPr>
-        <w:t>Most rows follow the vowel order a, i, u, e, o, even when one sound is slightly irregular.</w:t>
+        <w:t>Most rows follow the vowel order a, i, u, e, o.</w:t>
       </w:r>
     </w:p>
     <w:p>
       <w:pPr>
-        <w:spacing w:before="0" w:after="20"/>
+        <w:spacing w:before="0" w:after="0"/>
         <w:ind w:left="340"/>
       </w:pPr>
       <w:r>
@@ -2650,7 +2290,7 @@
           <w:b/>
           <w:i w:val="0"/>
           <w:color w:val="E6A817"/>
-          <w:sz w:val="20"/>
+          <w:sz w:val="18"/>
         </w:rPr>
         <w:t xml:space="preserve">▸ </w:t>
       </w:r>
@@ -2660,34 +2300,14 @@
           <w:b w:val="0"/>
           <w:i w:val="0"/>
           <w:color w:val="1A1A2E"/>
-          <w:sz w:val="20"/>
+          <w:sz w:val="18"/>
         </w:rPr>
-        <w:t>If a row has a special reading, say it slowly first and then return to the full row pattern.</w:t>
+        <w:t>Point to one letter at a time and say the full sound in one step.</w:t>
       </w:r>
     </w:p>
     <w:p>
       <w:pPr>
-        <w:spacing w:after="20"/>
-      </w:pPr>
-    </w:p>
-    <w:p>
-      <w:pPr>
-        <w:spacing w:before="80" w:after="40"/>
-      </w:pPr>
-      <w:r>
-        <w:rPr>
-          <w:rFonts w:ascii="Calibri" w:hAnsi="Calibri"/>
-          <w:b/>
-          <w:i w:val="0"/>
-          <w:color w:val="007A87"/>
-          <w:sz w:val="24"/>
-        </w:rPr>
-        <w:t>How to study this set</w:t>
-      </w:r>
-    </w:p>
-    <w:p>
-      <w:pPr>
-        <w:spacing w:before="0" w:after="20"/>
+        <w:spacing w:before="0" w:after="0"/>
         <w:ind w:left="340"/>
       </w:pPr>
       <w:r>
@@ -2696,7 +2316,7 @@
           <w:b/>
           <w:i w:val="0"/>
           <w:color w:val="E6A817"/>
-          <w:sz w:val="20"/>
+          <w:sz w:val="18"/>
         </w:rPr>
         <w:t xml:space="preserve">▸ </w:t>
       </w:r>
@@ -2706,159 +2326,9 @@
           <w:b w:val="0"/>
           <w:i w:val="0"/>
           <w:color w:val="1A1A2E"/>
-          <w:sz w:val="20"/>
-        </w:rPr>
-        <w:t>Point to one letter at a time and say the full sound in one step, such as ka or shi.</w:t>
-      </w:r>
-    </w:p>
-    <w:p>
-      <w:pPr>
-        <w:spacing w:before="0" w:after="20"/>
-        <w:ind w:left="340"/>
-      </w:pPr>
-      <w:r>
-        <w:rPr>
-          <w:rFonts w:ascii="Calibri" w:hAnsi="Calibri"/>
-          <w:b/>
-          <w:i w:val="0"/>
-          <w:color w:val="E6A817"/>
-          <w:sz w:val="20"/>
-        </w:rPr>
-        <w:t xml:space="preserve">▸ </w:t>
-      </w:r>
-      <w:r>
-        <w:rPr>
-          <w:rFonts w:ascii="Calibri" w:hAnsi="Calibri"/>
-          <w:b w:val="0"/>
-          <w:i w:val="0"/>
-          <w:color w:val="1A1A2E"/>
-          <w:sz w:val="20"/>
-        </w:rPr>
-        <w:t>When you read a practice pair, do not stop too long between the two kana.</w:t>
-      </w:r>
-    </w:p>
-    <w:p>
-      <w:pPr>
-        <w:spacing w:before="0" w:after="20"/>
-        <w:ind w:left="340"/>
-      </w:pPr>
-      <w:r>
-        <w:rPr>
-          <w:rFonts w:ascii="Calibri" w:hAnsi="Calibri"/>
-          <w:b/>
-          <w:i w:val="0"/>
-          <w:color w:val="E6A817"/>
-          <w:sz w:val="20"/>
-        </w:rPr>
-        <w:t xml:space="preserve">▸ </w:t>
-      </w:r>
-      <w:r>
-        <w:rPr>
-          <w:rFonts w:ascii="Calibri" w:hAnsi="Calibri"/>
-          <w:b w:val="0"/>
-          <w:i w:val="0"/>
-          <w:color w:val="1A1A2E"/>
-          <w:sz w:val="20"/>
-        </w:rPr>
-        <w:t>After checking the answer key, cover the sound column and quiz yourself again from memory.</w:t>
-      </w:r>
-    </w:p>
-    <w:p>
-      <w:pPr>
-        <w:spacing w:after="20"/>
-      </w:pPr>
-    </w:p>
-    <w:p>
-      <w:pPr>
-        <w:spacing w:before="120" w:after="40"/>
-      </w:pPr>
-      <w:r>
-        <w:rPr>
-          <w:rFonts w:ascii="Calibri" w:hAnsi="Calibri"/>
-          <w:b/>
-          <w:i w:val="0"/>
-          <w:color w:val="1A3A5C"/>
-          <w:sz w:val="28"/>
-        </w:rPr>
-        <w:t>Beginner notes</w:t>
-      </w:r>
-    </w:p>
-    <w:p>
-      <w:pPr>
-        <w:spacing w:before="0" w:after="20"/>
-        <w:ind w:left="340"/>
-      </w:pPr>
-      <w:r>
-        <w:rPr>
-          <w:rFonts w:ascii="Calibri" w:hAnsi="Calibri"/>
-          <w:b/>
-          <w:i w:val="0"/>
-          <w:color w:val="E6A817"/>
-          <w:sz w:val="20"/>
-        </w:rPr>
-        <w:t xml:space="preserve">▸ </w:t>
-      </w:r>
-      <w:r>
-        <w:rPr>
-          <w:rFonts w:ascii="Calibri" w:hAnsi="Calibri"/>
-          <w:b w:val="0"/>
-          <w:i w:val="0"/>
-          <w:color w:val="1A1A2E"/>
-          <w:sz w:val="20"/>
+          <w:sz w:val="18"/>
         </w:rPr>
         <w:t>These five vowels are the sound base for all the other hiragana rows.</w:t>
-      </w:r>
-    </w:p>
-    <w:p>
-      <w:pPr>
-        <w:spacing w:before="0" w:after="20"/>
-        <w:ind w:left="340"/>
-      </w:pPr>
-      <w:r>
-        <w:rPr>
-          <w:rFonts w:ascii="Calibri" w:hAnsi="Calibri"/>
-          <w:b/>
-          <w:i w:val="0"/>
-          <w:color w:val="E6A817"/>
-          <w:sz w:val="20"/>
-        </w:rPr>
-        <w:t xml:space="preserve">▸ </w:t>
-      </w:r>
-      <w:r>
-        <w:rPr>
-          <w:rFonts w:ascii="Calibri" w:hAnsi="Calibri"/>
-          <w:b w:val="0"/>
-          <w:i w:val="0"/>
-          <w:color w:val="1A1A2E"/>
-          <w:sz w:val="20"/>
-        </w:rPr>
-        <w:t>Say each vowel evenly without stretching it too much.</w:t>
-      </w:r>
-    </w:p>
-    <w:p>
-      <w:pPr>
-        <w:spacing w:before="0" w:after="20"/>
-        <w:ind w:left="340"/>
-      </w:pPr>
-      <w:r>
-        <w:rPr>
-          <w:rFonts w:ascii="Calibri" w:hAnsi="Calibri"/>
-          <w:b/>
-          <w:i w:val="0"/>
-          <w:color w:val="E6A817"/>
-          <w:sz w:val="20"/>
-        </w:rPr>
-        <w:t xml:space="preserve">▸ </w:t>
-      </w:r>
-      <w:r>
-        <w:rPr>
-          <w:rFonts w:ascii="Calibri" w:hAnsi="Calibri"/>
-          <w:b w:val="0"/>
-          <w:i w:val="0"/>
-          <w:color w:val="1A1A2E"/>
-          <w:sz w:val="20"/>
-        </w:rPr>
-        <w:t>Read two-kana practice by saying one sound, then the next: あい = a-i.</w:t>
       </w:r>
     </w:p>
     <w:sectPr>

</xml_diff>

<commit_message>
Add four-unit hiragana worksheet structure
Co-authored-by: sin-boo <sin-boo@users.noreply.github.com>
</commit_message>
<xml_diff>
--- a/japanese_docs/output/docs/hiragana_series/hira_01_vowels.docx
+++ b/japanese_docs/output/docs/hiragana_series/hira_01_vowels.docx
@@ -252,9 +252,9 @@
           <w:b w:val="0"/>
           <w:i w:val="0"/>
           <w:color w:val="1A1A2E"/>
-          <w:sz w:val="18"/>
+          <w:sz w:val="16"/>
         </w:rPr>
-        <w:t>This worksheet focuses on the set: あ い う え お.</w:t>
+        <w:t>Set: あ い う え お. Learn the five basic vowel sounds. These vowels appear in almost every Japanese word.</w:t>
       </w:r>
     </w:p>
     <w:p>
@@ -269,41 +269,7 @@
           <w:b w:val="0"/>
           <w:i w:val="0"/>
           <w:color w:val="1A1A2E"/>
-          <w:sz w:val="18"/>
-        </w:rPr>
-        <w:t>Each hiragana letter stands for one sound chunk or beat.</w:t>
-      </w:r>
-    </w:p>
-    <w:p>
-      <w:pPr>
-        <w:pStyle w:val="ListBullet"/>
-        <w:spacing w:before="0" w:after="0"/>
-        <w:ind w:left="340"/>
-      </w:pPr>
-      <w:r>
-        <w:rPr>
-          <w:rFonts w:ascii="Calibri" w:hAnsi="Calibri"/>
-          <w:b w:val="0"/>
-          <w:i w:val="0"/>
-          <w:color w:val="1A1A2E"/>
-          <w:sz w:val="18"/>
-        </w:rPr>
-        <w:t>Learn the five basic vowel sounds. These vowels appear in almost every Japanese word.</w:t>
-      </w:r>
-    </w:p>
-    <w:p>
-      <w:pPr>
-        <w:pStyle w:val="ListBullet"/>
-        <w:spacing w:before="0" w:after="0"/>
-        <w:ind w:left="340"/>
-      </w:pPr>
-      <w:r>
-        <w:rPr>
-          <w:rFonts w:ascii="Calibri" w:hAnsi="Calibri"/>
-          <w:b w:val="0"/>
-          <w:i w:val="0"/>
-          <w:color w:val="1A1A2E"/>
-          <w:sz w:val="18"/>
+          <w:sz w:val="16"/>
         </w:rPr>
         <w:t>These five vowels are the sound base of the whole hiragana chart: a, i, u, e, o. This set is very regular, so you can focus on the letter shape and the changing vowel sound.</w:t>
       </w:r>
@@ -320,9 +286,9 @@
           <w:b w:val="0"/>
           <w:i w:val="0"/>
           <w:color w:val="1A1A2E"/>
-          <w:sz w:val="18"/>
+          <w:sz w:val="16"/>
         </w:rPr>
-        <w:t>You will do two activities: write the reading from memory, then use row-pattern practice to check if you really know the set.</w:t>
+        <w:t>Parts: write the reading, fill a pattern, find the odd one out, and answer true or false.</w:t>
       </w:r>
     </w:p>
     <w:p>
@@ -357,9 +323,9 @@
           <w:b w:val="0"/>
           <w:i w:val="0"/>
           <w:color w:val="1A1A2E"/>
-          <w:sz w:val="20"/>
+          <w:sz w:val="18"/>
         </w:rPr>
-        <w:t xml:space="preserve">These examples show the </w:t>
+        <w:t xml:space="preserve">Format only example from another row: </w:t>
       </w:r>
       <w:r>
         <w:rPr>
@@ -367,39 +333,9 @@
           <w:b/>
           <w:i w:val="0"/>
           <w:color w:val="007A87"/>
-          <w:sz w:val="20"/>
+          <w:sz w:val="18"/>
         </w:rPr>
-        <w:t>format only</w:t>
-      </w:r>
-      <w:r>
-        <w:rPr>
-          <w:rFonts w:ascii="Calibri" w:hAnsi="Calibri"/>
-          <w:b w:val="0"/>
-          <w:i w:val="0"/>
-          <w:color w:val="1A1A2E"/>
-          <w:sz w:val="20"/>
-        </w:rPr>
-        <w:t xml:space="preserve">. They are </w:t>
-      </w:r>
-      <w:r>
-        <w:rPr>
-          <w:rFonts w:ascii="Calibri" w:hAnsi="Calibri"/>
-          <w:b/>
-          <w:i w:val="0"/>
-          <w:color w:val="1A3A5C"/>
-          <w:sz w:val="20"/>
-        </w:rPr>
-        <w:t>not</w:t>
-      </w:r>
-      <w:r>
-        <w:rPr>
-          <w:rFonts w:ascii="Calibri" w:hAnsi="Calibri"/>
-          <w:b w:val="0"/>
-          <w:i w:val="0"/>
-          <w:color w:val="1A1A2E"/>
-          <w:sz w:val="20"/>
-        </w:rPr>
-        <w:t xml:space="preserve"> answers to the real questions below.</w:t>
+        <w:t>さ = sa</w:t>
       </w:r>
     </w:p>
     <w:tbl>
@@ -409,13 +345,12 @@
         <w:tblLook w:firstColumn="1" w:firstRow="1" w:lastColumn="0" w:lastRow="0" w:noHBand="0" w:noVBand="1" w:val="04A0"/>
       </w:tblPr>
       <w:tblGrid>
-        <w:gridCol w:w="5832"/>
-        <w:gridCol w:w="5832"/>
+        <w:gridCol w:w="11664"/>
       </w:tblGrid>
       <w:tr>
         <w:tc>
           <w:tcPr>
-            <w:tcW w:type="dxa" w:w="5832"/>
+            <w:tcW w:type="dxa" w:w="11664"/>
             <w:shd w:val="clear" w:color="auto" w:fill="F0F6FA"/>
             <w:vAlign w:val="top"/>
           </w:tcPr>
@@ -431,7 +366,7 @@
                 <w:color w:val="007A87"/>
                 <w:sz w:val="16"/>
               </w:rPr>
-              <w:t>Example</w:t>
+              <w:t>Pattern example</w:t>
             </w:r>
           </w:p>
           <w:p>
@@ -444,59 +379,7 @@
                 <w:b/>
                 <w:i w:val="0"/>
                 <w:color w:val="1A3A5C"/>
-                <w:sz w:val="20"/>
-              </w:rPr>
-              <w:t>さ  -&gt;  sa</w:t>
-            </w:r>
-          </w:p>
-          <w:p>
-            <w:pPr>
-              <w:spacing w:before="0" w:after="20"/>
-            </w:pPr>
-            <w:r>
-              <w:rPr>
-                <w:rFonts w:ascii="Calibri" w:hAnsi="Calibri"/>
-                <w:b w:val="0"/>
-                <w:i w:val="0"/>
-                <w:color w:val="1A1A2E"/>
-                <w:sz w:val="16"/>
-              </w:rPr>
-              <w:t>Answer: Example from a different row.</w:t>
-            </w:r>
-          </w:p>
-        </w:tc>
-        <w:tc>
-          <w:tcPr>
-            <w:tcW w:type="dxa" w:w="5832"/>
-            <w:shd w:val="clear" w:color="auto" w:fill="F0F6FA"/>
-            <w:vAlign w:val="top"/>
-          </w:tcPr>
-          <w:p>
-            <w:pPr>
-              <w:spacing w:before="20" w:after="0"/>
-            </w:pPr>
-            <w:r>
-              <w:rPr>
-                <w:rFonts w:ascii="Calibri" w:hAnsi="Calibri"/>
-                <w:b/>
-                <w:i w:val="0"/>
-                <w:color w:val="007A87"/>
-                <w:sz w:val="16"/>
-              </w:rPr>
-              <w:t>Example</w:t>
-            </w:r>
-          </w:p>
-          <w:p>
-            <w:pPr>
-              <w:spacing w:before="0" w:after="0"/>
-            </w:pPr>
-            <w:r>
-              <w:rPr>
-                <w:rFonts w:ascii="Calibri" w:hAnsi="Calibri"/>
-                <w:b/>
-                <w:i w:val="0"/>
-                <w:color w:val="1A3A5C"/>
-                <w:sz w:val="20"/>
+                <w:sz w:val="18"/>
               </w:rPr>
               <w:t>さ  __  す  __  そ</w:t>
             </w:r>
@@ -538,7 +421,7 @@
           <w:color w:val="FFFFFF"/>
           <w:sz w:val="24"/>
         </w:rPr>
-        <w:t>Activity 1 — Write the Reading</w:t>
+        <w:t>Unit 1 — Write the Reading</w:t>
       </w:r>
     </w:p>
     <w:p>
@@ -551,39 +434,9 @@
           <w:b w:val="0"/>
           <w:i w:val="0"/>
           <w:color w:val="1A1A2E"/>
-          <w:sz w:val="20"/>
+          <w:sz w:val="16"/>
         </w:rPr>
-        <w:t xml:space="preserve">Look at each kana and </w:t>
-      </w:r>
-      <w:r>
-        <w:rPr>
-          <w:rFonts w:ascii="Calibri" w:hAnsi="Calibri"/>
-          <w:b/>
-          <w:i w:val="0"/>
-          <w:color w:val="007A87"/>
-          <w:sz w:val="18"/>
-        </w:rPr>
-        <w:t>write its reading in romaji</w:t>
-      </w:r>
-      <w:r>
-        <w:rPr>
-          <w:rFonts w:ascii="Calibri" w:hAnsi="Calibri"/>
-          <w:b w:val="0"/>
-          <w:i w:val="0"/>
-          <w:color w:val="1A1A2E"/>
-          <w:sz w:val="18"/>
-        </w:rPr>
-        <w:t xml:space="preserve">. Example from another row: </w:t>
-      </w:r>
-      <w:r>
-        <w:rPr>
-          <w:rFonts w:ascii="Calibri" w:hAnsi="Calibri"/>
-          <w:b w:val="0"/>
-          <w:i/>
-          <w:color w:val="6B7B8D"/>
-          <w:sz w:val="18"/>
-        </w:rPr>
-        <w:t>さ = sa.</w:t>
+        <w:t>Write the romaji reading for each kana.</w:t>
       </w:r>
     </w:p>
     <w:tbl>
@@ -615,7 +468,7 @@
                 <w:b/>
                 <w:i w:val="0"/>
                 <w:color w:val="FFFFFF"/>
-                <w:sz w:val="18"/>
+                <w:sz w:val="16"/>
               </w:rPr>
               <w:t>#</w:t>
             </w:r>
@@ -638,7 +491,7 @@
                 <w:b/>
                 <w:i w:val="0"/>
                 <w:color w:val="FFFFFF"/>
-                <w:sz w:val="18"/>
+                <w:sz w:val="16"/>
               </w:rPr>
               <w:t>Kana</w:t>
             </w:r>
@@ -661,7 +514,7 @@
                 <w:b/>
                 <w:i w:val="0"/>
                 <w:color w:val="FFFFFF"/>
-                <w:sz w:val="18"/>
+                <w:sz w:val="16"/>
               </w:rPr>
               <w:t>Your reading</w:t>
             </w:r>
@@ -686,7 +539,7 @@
                 <w:b/>
                 <w:i w:val="0"/>
                 <w:color w:val="6B7B8D"/>
-                <w:sz w:val="18"/>
+                <w:sz w:val="16"/>
               </w:rPr>
               <w:t>1</w:t>
             </w:r>
@@ -709,7 +562,7 @@
                 <w:b/>
                 <w:i w:val="0"/>
                 <w:color w:val="1A3A5C"/>
-                <w:sz w:val="26"/>
+                <w:sz w:val="24"/>
               </w:rPr>
               <w:t>あ</w:t>
             </w:r>
@@ -732,7 +585,7 @@
                 <w:b w:val="0"/>
                 <w:i w:val="0"/>
                 <w:color w:val="1A1A2E"/>
-                <w:sz w:val="18"/>
+                <w:sz w:val="16"/>
               </w:rPr>
               <w:t>__________________</w:t>
             </w:r>
@@ -757,7 +610,7 @@
                 <w:b/>
                 <w:i w:val="0"/>
                 <w:color w:val="6B7B8D"/>
-                <w:sz w:val="18"/>
+                <w:sz w:val="16"/>
               </w:rPr>
               <w:t>2</w:t>
             </w:r>
@@ -780,7 +633,7 @@
                 <w:b/>
                 <w:i w:val="0"/>
                 <w:color w:val="1A3A5C"/>
-                <w:sz w:val="26"/>
+                <w:sz w:val="24"/>
               </w:rPr>
               <w:t>い</w:t>
             </w:r>
@@ -803,7 +656,7 @@
                 <w:b w:val="0"/>
                 <w:i w:val="0"/>
                 <w:color w:val="1A1A2E"/>
-                <w:sz w:val="18"/>
+                <w:sz w:val="16"/>
               </w:rPr>
               <w:t>__________________</w:t>
             </w:r>
@@ -828,7 +681,7 @@
                 <w:b/>
                 <w:i w:val="0"/>
                 <w:color w:val="6B7B8D"/>
-                <w:sz w:val="18"/>
+                <w:sz w:val="16"/>
               </w:rPr>
               <w:t>3</w:t>
             </w:r>
@@ -851,7 +704,7 @@
                 <w:b/>
                 <w:i w:val="0"/>
                 <w:color w:val="1A3A5C"/>
-                <w:sz w:val="26"/>
+                <w:sz w:val="24"/>
               </w:rPr>
               <w:t>う</w:t>
             </w:r>
@@ -874,7 +727,7 @@
                 <w:b w:val="0"/>
                 <w:i w:val="0"/>
                 <w:color w:val="1A1A2E"/>
-                <w:sz w:val="18"/>
+                <w:sz w:val="16"/>
               </w:rPr>
               <w:t>__________________</w:t>
             </w:r>
@@ -899,7 +752,7 @@
                 <w:b/>
                 <w:i w:val="0"/>
                 <w:color w:val="6B7B8D"/>
-                <w:sz w:val="18"/>
+                <w:sz w:val="16"/>
               </w:rPr>
               <w:t>4</w:t>
             </w:r>
@@ -922,7 +775,7 @@
                 <w:b/>
                 <w:i w:val="0"/>
                 <w:color w:val="1A3A5C"/>
-                <w:sz w:val="26"/>
+                <w:sz w:val="24"/>
               </w:rPr>
               <w:t>え</w:t>
             </w:r>
@@ -945,7 +798,7 @@
                 <w:b w:val="0"/>
                 <w:i w:val="0"/>
                 <w:color w:val="1A1A2E"/>
-                <w:sz w:val="18"/>
+                <w:sz w:val="16"/>
               </w:rPr>
               <w:t>__________________</w:t>
             </w:r>
@@ -970,7 +823,7 @@
                 <w:b/>
                 <w:i w:val="0"/>
                 <w:color w:val="6B7B8D"/>
-                <w:sz w:val="18"/>
+                <w:sz w:val="16"/>
               </w:rPr>
               <w:t>5</w:t>
             </w:r>
@@ -993,7 +846,7 @@
                 <w:b/>
                 <w:i w:val="0"/>
                 <w:color w:val="1A3A5C"/>
-                <w:sz w:val="26"/>
+                <w:sz w:val="24"/>
               </w:rPr>
               <w:t>お</w:t>
             </w:r>
@@ -1016,7 +869,7 @@
                 <w:b w:val="0"/>
                 <w:i w:val="0"/>
                 <w:color w:val="1A1A2E"/>
-                <w:sz w:val="18"/>
+                <w:sz w:val="16"/>
               </w:rPr>
               <w:t>__________________</w:t>
             </w:r>
@@ -1043,7 +896,7 @@
           <w:color w:val="FFFFFF"/>
           <w:sz w:val="24"/>
         </w:rPr>
-        <w:t>Activity 2 — Pattern Practice</w:t>
+        <w:t>Unit 2 — Fill in the Missing Kana</w:t>
       </w:r>
     </w:p>
     <w:p>
@@ -1056,49 +909,9 @@
           <w:b w:val="0"/>
           <w:i w:val="0"/>
           <w:color w:val="1A1A2E"/>
-          <w:sz w:val="20"/>
+          <w:sz w:val="16"/>
         </w:rPr>
-        <w:t xml:space="preserve">Use the row pattern to help you. </w:t>
-      </w:r>
-      <w:r>
-        <w:rPr>
-          <w:rFonts w:ascii="Calibri" w:hAnsi="Calibri"/>
-          <w:b/>
-          <w:i w:val="0"/>
-          <w:color w:val="007A87"/>
-          <w:sz w:val="18"/>
-        </w:rPr>
-        <w:t>Fill in the missing kana</w:t>
-      </w:r>
-      <w:r>
-        <w:rPr>
-          <w:rFonts w:ascii="Calibri" w:hAnsi="Calibri"/>
-          <w:b w:val="0"/>
-          <w:i w:val="0"/>
-          <w:color w:val="1A1A2E"/>
-          <w:sz w:val="20"/>
-        </w:rPr>
-        <w:t xml:space="preserve"> and </w:t>
-      </w:r>
-      <w:r>
-        <w:rPr>
-          <w:rFonts w:ascii="Calibri" w:hAnsi="Calibri"/>
-          <w:b/>
-          <w:i w:val="0"/>
-          <w:color w:val="1A3A5C"/>
-          <w:sz w:val="18"/>
-        </w:rPr>
-        <w:t>circle the one that does not belong</w:t>
-      </w:r>
-      <w:r>
-        <w:rPr>
-          <w:rFonts w:ascii="Calibri" w:hAnsi="Calibri"/>
-          <w:b w:val="0"/>
-          <w:i w:val="0"/>
-          <w:color w:val="1A1A2E"/>
-          <w:sz w:val="20"/>
-        </w:rPr>
-        <w:t>.</w:t>
+        <w:t>Fill in the missing kana to complete the row.</w:t>
       </w:r>
     </w:p>
     <w:tbl>
@@ -1129,7 +942,7 @@
                 <w:b/>
                 <w:i w:val="0"/>
                 <w:color w:val="FFFFFF"/>
-                <w:sz w:val="18"/>
+                <w:sz w:val="16"/>
               </w:rPr>
               <w:t>Fill in the missing kana</w:t>
             </w:r>
@@ -1152,7 +965,7 @@
                 <w:b/>
                 <w:i w:val="0"/>
                 <w:color w:val="FFFFFF"/>
-                <w:sz w:val="18"/>
+                <w:sz w:val="16"/>
               </w:rPr>
               <w:t>Your answer</w:t>
             </w:r>
@@ -1177,7 +990,7 @@
                 <w:b/>
                 <w:i w:val="0"/>
                 <w:color w:val="1A3A5C"/>
-                <w:sz w:val="22"/>
+                <w:sz w:val="20"/>
               </w:rPr>
               <w:t>あ  __  う  __  お</w:t>
             </w:r>
@@ -1200,7 +1013,7 @@
                 <w:b w:val="0"/>
                 <w:i w:val="0"/>
                 <w:color w:val="1A1A2E"/>
-                <w:sz w:val="18"/>
+                <w:sz w:val="16"/>
               </w:rPr>
               <w:t>__________________</w:t>
             </w:r>
@@ -1208,6 +1021,43 @@
         </w:tc>
       </w:tr>
     </w:tbl>
+    <w:p>
+      <w:pPr>
+        <w:spacing w:after="0"/>
+      </w:pPr>
+    </w:p>
+    <w:p>
+      <w:pPr>
+        <w:spacing w:before="60" w:after="40"/>
+        <w:ind w:left="170"/>
+        <w:shd w:val="clear" w:color="auto" w:fill="007A87"/>
+      </w:pPr>
+      <w:r>
+        <w:rPr>
+          <w:rFonts w:ascii="Calibri" w:hAnsi="Calibri"/>
+          <w:b/>
+          <w:i w:val="0"/>
+          <w:color w:val="FFFFFF"/>
+          <w:sz w:val="24"/>
+        </w:rPr>
+        <w:t>Unit 3 — Find the Odd One Out</w:t>
+      </w:r>
+    </w:p>
+    <w:p>
+      <w:pPr>
+        <w:spacing w:before="0" w:after="20"/>
+      </w:pPr>
+      <w:r>
+        <w:rPr>
+          <w:rFonts w:ascii="Calibri" w:hAnsi="Calibri"/>
+          <w:b w:val="0"/>
+          <w:i w:val="0"/>
+          <w:color w:val="1A1A2E"/>
+          <w:sz w:val="16"/>
+        </w:rPr>
+        <w:t>Write the one kana that does not belong.</w:t>
+      </w:r>
+    </w:p>
     <w:tbl>
       <w:tblPr>
         <w:tblStyle w:val="TableGrid"/>
@@ -1236,7 +1086,7 @@
                 <w:b/>
                 <w:i w:val="0"/>
                 <w:color w:val="FFFFFF"/>
-                <w:sz w:val="18"/>
+                <w:sz w:val="16"/>
               </w:rPr>
               <w:t>Circle the kana that does not belong</w:t>
             </w:r>
@@ -1259,7 +1109,7 @@
                 <w:b/>
                 <w:i w:val="0"/>
                 <w:color w:val="FFFFFF"/>
-                <w:sz w:val="18"/>
+                <w:sz w:val="16"/>
               </w:rPr>
               <w:t>Your answer</w:t>
             </w:r>
@@ -1284,7 +1134,7 @@
                 <w:b/>
                 <w:i w:val="0"/>
                 <w:color w:val="1A3A5C"/>
-                <w:sz w:val="22"/>
+                <w:sz w:val="20"/>
               </w:rPr>
               <w:t>か   あ   い   う</w:t>
             </w:r>
@@ -1307,7 +1157,7 @@
                 <w:b w:val="0"/>
                 <w:i w:val="0"/>
                 <w:color w:val="1A1A2E"/>
-                <w:sz w:val="18"/>
+                <w:sz w:val="16"/>
               </w:rPr>
               <w:t>________</w:t>
             </w:r>
@@ -1332,7 +1182,7 @@
                 <w:b/>
                 <w:i w:val="0"/>
                 <w:color w:val="1A3A5C"/>
-                <w:sz w:val="22"/>
+                <w:sz w:val="20"/>
               </w:rPr>
               <w:t>い   き   う   え</w:t>
             </w:r>
@@ -1355,7 +1205,197 @@
                 <w:b w:val="0"/>
                 <w:i w:val="0"/>
                 <w:color w:val="1A1A2E"/>
-                <w:sz w:val="18"/>
+                <w:sz w:val="16"/>
+              </w:rPr>
+              <w:t>________</w:t>
+            </w:r>
+          </w:p>
+        </w:tc>
+      </w:tr>
+    </w:tbl>
+    <w:p>
+      <w:pPr>
+        <w:spacing w:after="0"/>
+      </w:pPr>
+    </w:p>
+    <w:p>
+      <w:pPr>
+        <w:spacing w:before="60" w:after="40"/>
+        <w:ind w:left="170"/>
+        <w:shd w:val="clear" w:color="auto" w:fill="E6A817"/>
+      </w:pPr>
+      <w:r>
+        <w:rPr>
+          <w:rFonts w:ascii="Calibri" w:hAnsi="Calibri"/>
+          <w:b/>
+          <w:i w:val="0"/>
+          <w:color w:val="FFFFFF"/>
+          <w:sz w:val="24"/>
+        </w:rPr>
+        <w:t>Unit 4 — True or False</w:t>
+      </w:r>
+    </w:p>
+    <w:p>
+      <w:pPr>
+        <w:spacing w:before="0" w:after="20"/>
+      </w:pPr>
+      <w:r>
+        <w:rPr>
+          <w:rFonts w:ascii="Calibri" w:hAnsi="Calibri"/>
+          <w:b w:val="0"/>
+          <w:i w:val="0"/>
+          <w:color w:val="1A1A2E"/>
+          <w:sz w:val="16"/>
+        </w:rPr>
+        <w:t>Write True or False for each sentence.</w:t>
+      </w:r>
+    </w:p>
+    <w:tbl>
+      <w:tblPr>
+        <w:tblStyle w:val="TableGrid"/>
+        <w:tblW w:type="auto" w:w="0"/>
+        <w:tblLook w:firstColumn="1" w:firstRow="1" w:lastColumn="0" w:lastRow="0" w:noHBand="0" w:noVBand="1" w:val="04A0"/>
+      </w:tblPr>
+      <w:tblGrid>
+        <w:gridCol w:w="5832"/>
+        <w:gridCol w:w="5832"/>
+      </w:tblGrid>
+      <w:tr>
+        <w:tc>
+          <w:tcPr>
+            <w:tcW w:type="dxa" w:w="5832"/>
+            <w:shd w:val="clear" w:color="auto" w:fill="1A3A5C"/>
+            <w:vAlign w:val="center"/>
+          </w:tcPr>
+          <w:p>
+            <w:pPr>
+              <w:spacing w:before="20" w:after="20"/>
+              <w:jc w:val="center"/>
+            </w:pPr>
+            <w:r>
+              <w:rPr>
+                <w:rFonts w:ascii="Calibri" w:hAnsi="Calibri"/>
+                <w:b/>
+                <w:i w:val="0"/>
+                <w:color w:val="FFFFFF"/>
+                <w:sz w:val="16"/>
+              </w:rPr>
+              <w:t>Statement</w:t>
+            </w:r>
+          </w:p>
+        </w:tc>
+        <w:tc>
+          <w:tcPr>
+            <w:tcW w:type="dxa" w:w="5832"/>
+            <w:shd w:val="clear" w:color="auto" w:fill="1A3A5C"/>
+            <w:vAlign w:val="center"/>
+          </w:tcPr>
+          <w:p>
+            <w:pPr>
+              <w:spacing w:before="20" w:after="20"/>
+              <w:jc w:val="center"/>
+            </w:pPr>
+            <w:r>
+              <w:rPr>
+                <w:rFonts w:ascii="Calibri" w:hAnsi="Calibri"/>
+                <w:b/>
+                <w:i w:val="0"/>
+                <w:color w:val="FFFFFF"/>
+                <w:sz w:val="16"/>
+              </w:rPr>
+              <w:t>True / False</w:t>
+            </w:r>
+          </w:p>
+        </w:tc>
+      </w:tr>
+      <w:tr>
+        <w:tc>
+          <w:tcPr>
+            <w:tcW w:type="dxa" w:w="5832"/>
+            <w:shd w:val="clear" w:color="auto" w:fill="F0F6FA"/>
+            <w:vAlign w:val="center"/>
+          </w:tcPr>
+          <w:p>
+            <w:pPr>
+              <w:spacing w:before="20" w:after="20"/>
+            </w:pPr>
+            <w:r>
+              <w:rPr>
+                <w:rFonts w:ascii="Calibri" w:hAnsi="Calibri"/>
+                <w:b w:val="0"/>
+                <w:i w:val="0"/>
+                <w:color w:val="1A1A2E"/>
+                <w:sz w:val="14"/>
+              </w:rPr>
+              <w:t>This set follows the sound order a, i, u, e, o.</w:t>
+            </w:r>
+          </w:p>
+        </w:tc>
+        <w:tc>
+          <w:tcPr>
+            <w:tcW w:type="dxa" w:w="5832"/>
+            <w:shd w:val="clear" w:color="auto" w:fill="F0F6FA"/>
+            <w:vAlign w:val="center"/>
+          </w:tcPr>
+          <w:p>
+            <w:pPr>
+              <w:spacing w:before="20" w:after="20"/>
+              <w:jc w:val="center"/>
+            </w:pPr>
+            <w:r>
+              <w:rPr>
+                <w:rFonts w:ascii="Calibri" w:hAnsi="Calibri"/>
+                <w:b w:val="0"/>
+                <w:i w:val="0"/>
+                <w:color w:val="1A1A2E"/>
+                <w:sz w:val="16"/>
+              </w:rPr>
+              <w:t>________</w:t>
+            </w:r>
+          </w:p>
+        </w:tc>
+      </w:tr>
+      <w:tr>
+        <w:tc>
+          <w:tcPr>
+            <w:tcW w:type="dxa" w:w="5832"/>
+            <w:shd w:val="clear" w:color="auto" w:fill="FFFFFF"/>
+            <w:vAlign w:val="center"/>
+          </w:tcPr>
+          <w:p>
+            <w:pPr>
+              <w:spacing w:before="20" w:after="20"/>
+            </w:pPr>
+            <w:r>
+              <w:rPr>
+                <w:rFonts w:ascii="Calibri" w:hAnsi="Calibri"/>
+                <w:b w:val="0"/>
+                <w:i w:val="0"/>
+                <w:color w:val="1A1A2E"/>
+                <w:sz w:val="14"/>
+              </w:rPr>
+              <w:t>This set has only three kana.</w:t>
+            </w:r>
+          </w:p>
+        </w:tc>
+        <w:tc>
+          <w:tcPr>
+            <w:tcW w:type="dxa" w:w="5832"/>
+            <w:shd w:val="clear" w:color="auto" w:fill="FFFFFF"/>
+            <w:vAlign w:val="center"/>
+          </w:tcPr>
+          <w:p>
+            <w:pPr>
+              <w:spacing w:before="20" w:after="20"/>
+              <w:jc w:val="center"/>
+            </w:pPr>
+            <w:r>
+              <w:rPr>
+                <w:rFonts w:ascii="Calibri" w:hAnsi="Calibri"/>
+                <w:b w:val="0"/>
+                <w:i w:val="0"/>
+                <w:color w:val="1A1A2E"/>
+                <w:sz w:val="16"/>
               </w:rPr>
               <w:t>________</w:t>
             </w:r>
@@ -1621,7 +1661,7 @@
           <w:color w:val="FFFFFF"/>
           <w:sz w:val="24"/>
         </w:rPr>
-        <w:t>Activity 1 Answers</w:t>
+        <w:t>Unit 1 Answers</w:t>
       </w:r>
     </w:p>
     <w:tbl>
@@ -1942,7 +1982,7 @@
           <w:color w:val="FFFFFF"/>
           <w:sz w:val="24"/>
         </w:rPr>
-        <w:t>Activity 2 Answers</w:t>
+        <w:t>Unit 2 Answers</w:t>
       </w:r>
     </w:p>
     <w:tbl>
@@ -2052,6 +2092,28 @@
         </w:tc>
       </w:tr>
     </w:tbl>
+    <w:p>
+      <w:pPr>
+        <w:spacing w:after="0"/>
+      </w:pPr>
+    </w:p>
+    <w:p>
+      <w:pPr>
+        <w:spacing w:before="60" w:after="40"/>
+        <w:ind w:left="170"/>
+        <w:shd w:val="clear" w:color="auto" w:fill="007A87"/>
+      </w:pPr>
+      <w:r>
+        <w:rPr>
+          <w:rFonts w:ascii="Calibri" w:hAnsi="Calibri"/>
+          <w:b/>
+          <w:i w:val="0"/>
+          <w:color w:val="FFFFFF"/>
+          <w:sz w:val="24"/>
+        </w:rPr>
+        <w:t>Unit 3 Answers</w:t>
+      </w:r>
+    </w:p>
     <w:tbl>
       <w:tblPr>
         <w:tblStyle w:val="TableGrid"/>
@@ -2202,6 +2264,181 @@
                 <w:sz w:val="18"/>
               </w:rPr>
               <w:t>き</w:t>
+            </w:r>
+          </w:p>
+        </w:tc>
+      </w:tr>
+    </w:tbl>
+    <w:p>
+      <w:pPr>
+        <w:spacing w:after="0"/>
+      </w:pPr>
+    </w:p>
+    <w:p>
+      <w:pPr>
+        <w:spacing w:before="60" w:after="40"/>
+        <w:ind w:left="170"/>
+        <w:shd w:val="clear" w:color="auto" w:fill="E6A817"/>
+      </w:pPr>
+      <w:r>
+        <w:rPr>
+          <w:rFonts w:ascii="Calibri" w:hAnsi="Calibri"/>
+          <w:b/>
+          <w:i w:val="0"/>
+          <w:color w:val="FFFFFF"/>
+          <w:sz w:val="24"/>
+        </w:rPr>
+        <w:t>Unit 4 Answers</w:t>
+      </w:r>
+    </w:p>
+    <w:tbl>
+      <w:tblPr>
+        <w:tblStyle w:val="TableGrid"/>
+        <w:tblW w:type="auto" w:w="0"/>
+        <w:tblLook w:firstColumn="1" w:firstRow="1" w:lastColumn="0" w:lastRow="0" w:noHBand="0" w:noVBand="1" w:val="04A0"/>
+      </w:tblPr>
+      <w:tblGrid>
+        <w:gridCol w:w="5832"/>
+        <w:gridCol w:w="5832"/>
+      </w:tblGrid>
+      <w:tr>
+        <w:tc>
+          <w:tcPr>
+            <w:tcW w:type="dxa" w:w="5832"/>
+            <w:shd w:val="clear" w:color="auto" w:fill="1A3A5C"/>
+            <w:vAlign w:val="center"/>
+          </w:tcPr>
+          <w:p>
+            <w:pPr>
+              <w:spacing w:before="20" w:after="20"/>
+              <w:jc w:val="center"/>
+            </w:pPr>
+            <w:r>
+              <w:rPr>
+                <w:rFonts w:ascii="Calibri" w:hAnsi="Calibri"/>
+                <w:b/>
+                <w:i w:val="0"/>
+                <w:color w:val="FFFFFF"/>
+                <w:sz w:val="18"/>
+              </w:rPr>
+              <w:t>Statement</w:t>
+            </w:r>
+          </w:p>
+        </w:tc>
+        <w:tc>
+          <w:tcPr>
+            <w:tcW w:type="dxa" w:w="5832"/>
+            <w:shd w:val="clear" w:color="auto" w:fill="1A3A5C"/>
+            <w:vAlign w:val="center"/>
+          </w:tcPr>
+          <w:p>
+            <w:pPr>
+              <w:spacing w:before="20" w:after="20"/>
+              <w:jc w:val="center"/>
+            </w:pPr>
+            <w:r>
+              <w:rPr>
+                <w:rFonts w:ascii="Calibri" w:hAnsi="Calibri"/>
+                <w:b/>
+                <w:i w:val="0"/>
+                <w:color w:val="FFFFFF"/>
+                <w:sz w:val="18"/>
+              </w:rPr>
+              <w:t>Answer</w:t>
+            </w:r>
+          </w:p>
+        </w:tc>
+      </w:tr>
+      <w:tr>
+        <w:tc>
+          <w:tcPr>
+            <w:tcW w:type="dxa" w:w="5832"/>
+            <w:shd w:val="clear" w:color="auto" w:fill="F0F6FA"/>
+            <w:vAlign w:val="center"/>
+          </w:tcPr>
+          <w:p>
+            <w:pPr>
+              <w:spacing w:before="20" w:after="20"/>
+            </w:pPr>
+            <w:r>
+              <w:rPr>
+                <w:rFonts w:ascii="Calibri" w:hAnsi="Calibri"/>
+                <w:b w:val="0"/>
+                <w:i w:val="0"/>
+                <w:color w:val="1A1A2E"/>
+                <w:sz w:val="16"/>
+              </w:rPr>
+              <w:t>This set follows the sound order a, i, u, e, o.</w:t>
+            </w:r>
+          </w:p>
+        </w:tc>
+        <w:tc>
+          <w:tcPr>
+            <w:tcW w:type="dxa" w:w="5832"/>
+            <w:shd w:val="clear" w:color="auto" w:fill="F0F6FA"/>
+            <w:vAlign w:val="center"/>
+          </w:tcPr>
+          <w:p>
+            <w:pPr>
+              <w:spacing w:before="20" w:after="20"/>
+              <w:jc w:val="center"/>
+            </w:pPr>
+            <w:r>
+              <w:rPr>
+                <w:rFonts w:ascii="Calibri" w:hAnsi="Calibri"/>
+                <w:b/>
+                <w:i w:val="0"/>
+                <w:color w:val="007A87"/>
+                <w:sz w:val="18"/>
+              </w:rPr>
+              <w:t>True</w:t>
+            </w:r>
+          </w:p>
+        </w:tc>
+      </w:tr>
+      <w:tr>
+        <w:tc>
+          <w:tcPr>
+            <w:tcW w:type="dxa" w:w="5832"/>
+            <w:shd w:val="clear" w:color="auto" w:fill="FFFFFF"/>
+            <w:vAlign w:val="center"/>
+          </w:tcPr>
+          <w:p>
+            <w:pPr>
+              <w:spacing w:before="20" w:after="20"/>
+            </w:pPr>
+            <w:r>
+              <w:rPr>
+                <w:rFonts w:ascii="Calibri" w:hAnsi="Calibri"/>
+                <w:b w:val="0"/>
+                <w:i w:val="0"/>
+                <w:color w:val="1A1A2E"/>
+                <w:sz w:val="16"/>
+              </w:rPr>
+              <w:t>This set has only three kana.</w:t>
+            </w:r>
+          </w:p>
+        </w:tc>
+        <w:tc>
+          <w:tcPr>
+            <w:tcW w:type="dxa" w:w="5832"/>
+            <w:shd w:val="clear" w:color="auto" w:fill="FFFFFF"/>
+            <w:vAlign w:val="center"/>
+          </w:tcPr>
+          <w:p>
+            <w:pPr>
+              <w:spacing w:before="20" w:after="20"/>
+              <w:jc w:val="center"/>
+            </w:pPr>
+            <w:r>
+              <w:rPr>
+                <w:rFonts w:ascii="Calibri" w:hAnsi="Calibri"/>
+                <w:b/>
+                <w:i w:val="0"/>
+                <w:color w:val="007A87"/>
+                <w:sz w:val="18"/>
+              </w:rPr>
+              <w:t>False</w:t>
             </w:r>
           </w:p>
         </w:tc>

</xml_diff>

<commit_message>
Split hiragana worksheets into three pages
Co-authored-by: sin-boo <sin-boo@users.noreply.github.com>
</commit_message>
<xml_diff>
--- a/japanese_docs/output/docs/hiragana_series/hira_01_vowels.docx
+++ b/japanese_docs/output/docs/hiragana_series/hira_01_vowels.docx
@@ -66,7 +66,7 @@
                 <w:color w:val="FFFFFF"/>
                 <w:sz w:val="20"/>
               </w:rPr>
-              <w:t>Student Worksheet  ·  Page 1 of 2</w:t>
+              <w:t>Student Worksheet  ·  Page 1 of 3</w:t>
             </w:r>
           </w:p>
         </w:tc>
@@ -879,6 +879,30 @@
     </w:tbl>
     <w:p>
       <w:pPr>
+        <w:spacing w:before="0" w:after="0"/>
+      </w:pPr>
+      <w:r>
+        <w:br w:type="page"/>
+      </w:r>
+    </w:p>
+    <w:p>
+      <w:pPr>
+        <w:spacing w:before="0" w:after="40"/>
+        <w:jc w:val="center"/>
+      </w:pPr>
+      <w:r>
+        <w:rPr>
+          <w:rFonts w:ascii="Calibri" w:hAnsi="Calibri"/>
+          <w:b w:val="0"/>
+          <w:i w:val="0"/>
+          <w:color w:val="6B7B8D"/>
+          <w:sz w:val="20"/>
+        </w:rPr>
+        <w:t>Student Worksheet  ·  Page 2 of 3</w:t>
+      </w:r>
+    </w:p>
+    <w:p>
+      <w:pPr>
         <w:spacing w:after="0"/>
       </w:pPr>
     </w:p>
@@ -1424,7 +1448,7 @@
           <w:color w:val="6B7B8D"/>
           <w:sz w:val="20"/>
         </w:rPr>
-        <w:t>Reference &amp; Answer Key  ·  Page 2 of 2</w:t>
+        <w:t>Reference &amp; Answer Key  ·  Page 3 of 3</w:t>
       </w:r>
     </w:p>
     <w:p>

</xml_diff>

<commit_message>
Expand hiragana page 3 review content
Co-authored-by: sin-boo <sin-boo@users.noreply.github.com>
</commit_message>
<xml_diff>
--- a/japanese_docs/output/docs/hiragana_series/hira_01_vowels.docx
+++ b/japanese_docs/output/docs/hiragana_series/hira_01_vowels.docx
@@ -1480,7 +1480,7 @@
           <w:color w:val="1A1A2E"/>
           <w:sz w:val="18"/>
         </w:rPr>
-        <w:t>Use this page as a reference after students finish page 1.</w:t>
+        <w:t>Use this page as a reference after students finish pages 1 and 2.</w:t>
       </w:r>
     </w:p>
     <w:tbl>
@@ -1641,28 +1641,96 @@
         <w:tc>
           <w:tcPr>
             <w:tcW w:type="dxa" w:w="5832"/>
+            <w:shd w:val="clear" w:color="auto" w:fill="F0F6FA"/>
+            <w:vAlign w:val="center"/>
           </w:tcPr>
-          <w:p/>
+          <w:p>
+            <w:pPr>
+              <w:spacing w:before="20" w:after="20"/>
+              <w:jc w:val="center"/>
+            </w:pPr>
+            <w:r>
+              <w:rPr>
+                <w:rFonts w:ascii="Calibri" w:hAnsi="Calibri"/>
+                <w:b/>
+                <w:i w:val="0"/>
+                <w:color w:val="1A3A5C"/>
+                <w:sz w:val="24"/>
+              </w:rPr>
+              <w:t>あお</w:t>
+            </w:r>
+          </w:p>
         </w:tc>
         <w:tc>
           <w:tcPr>
             <w:tcW w:type="dxa" w:w="5832"/>
+            <w:shd w:val="clear" w:color="auto" w:fill="F0F6FA"/>
+            <w:vAlign w:val="center"/>
           </w:tcPr>
-          <w:p/>
+          <w:p>
+            <w:pPr>
+              <w:spacing w:before="20" w:after="20"/>
+              <w:jc w:val="center"/>
+            </w:pPr>
+            <w:r>
+              <w:rPr>
+                <w:rFonts w:ascii="Calibri" w:hAnsi="Calibri"/>
+                <w:b w:val="0"/>
+                <w:i w:val="0"/>
+                <w:color w:val="1A1A2E"/>
+                <w:sz w:val="18"/>
+              </w:rPr>
+              <w:t>a-o</w:t>
+            </w:r>
+          </w:p>
         </w:tc>
       </w:tr>
       <w:tr>
         <w:tc>
           <w:tcPr>
             <w:tcW w:type="dxa" w:w="5832"/>
+            <w:shd w:val="clear" w:color="auto" w:fill="FFFFFF"/>
+            <w:vAlign w:val="center"/>
           </w:tcPr>
-          <w:p/>
+          <w:p>
+            <w:pPr>
+              <w:spacing w:before="20" w:after="20"/>
+              <w:jc w:val="center"/>
+            </w:pPr>
+            <w:r>
+              <w:rPr>
+                <w:rFonts w:ascii="Calibri" w:hAnsi="Calibri"/>
+                <w:b/>
+                <w:i w:val="0"/>
+                <w:color w:val="1A3A5C"/>
+                <w:sz w:val="24"/>
+              </w:rPr>
+              <w:t>いえ</w:t>
+            </w:r>
+          </w:p>
         </w:tc>
         <w:tc>
           <w:tcPr>
             <w:tcW w:type="dxa" w:w="5832"/>
+            <w:shd w:val="clear" w:color="auto" w:fill="FFFFFF"/>
+            <w:vAlign w:val="center"/>
           </w:tcPr>
-          <w:p/>
+          <w:p>
+            <w:pPr>
+              <w:spacing w:before="20" w:after="20"/>
+              <w:jc w:val="center"/>
+            </w:pPr>
+            <w:r>
+              <w:rPr>
+                <w:rFonts w:ascii="Calibri" w:hAnsi="Calibri"/>
+                <w:b w:val="0"/>
+                <w:i w:val="0"/>
+                <w:color w:val="1A1A2E"/>
+                <w:sz w:val="18"/>
+              </w:rPr>
+              <w:t>i-e</w:t>
+            </w:r>
+          </w:p>
         </w:tc>
       </w:tr>
     </w:tbl>
@@ -2592,6 +2660,131 @@
         <w:t>These five vowels are the sound base for all the other hiragana rows.</w:t>
       </w:r>
     </w:p>
+    <w:p>
+      <w:pPr>
+        <w:spacing w:after="0"/>
+      </w:pPr>
+    </w:p>
+    <w:p>
+      <w:pPr>
+        <w:spacing w:before="80" w:after="40"/>
+      </w:pPr>
+      <w:r>
+        <w:rPr>
+          <w:rFonts w:ascii="Calibri" w:hAnsi="Calibri"/>
+          <w:b/>
+          <w:i w:val="0"/>
+          <w:color w:val="007A87"/>
+          <w:sz w:val="24"/>
+        </w:rPr>
+        <w:t>Memory helper</w:t>
+      </w:r>
+    </w:p>
+    <w:tbl>
+      <w:tblPr>
+        <w:tblStyle w:val="TableGrid"/>
+        <w:tblW w:type="auto" w:w="0"/>
+        <w:tblLook w:firstColumn="1" w:firstRow="1" w:lastColumn="0" w:lastRow="0" w:noHBand="0" w:noVBand="1" w:val="04A0"/>
+      </w:tblPr>
+      <w:tblGrid>
+        <w:gridCol w:w="5832"/>
+        <w:gridCol w:w="5832"/>
+      </w:tblGrid>
+      <w:tr>
+        <w:tc>
+          <w:tcPr>
+            <w:tcW w:type="dxa" w:w="5832"/>
+            <w:shd w:val="clear" w:color="auto" w:fill="F0F6FA"/>
+            <w:vAlign w:val="center"/>
+          </w:tcPr>
+          <w:p>
+            <w:pPr>
+              <w:spacing w:before="20" w:after="20"/>
+            </w:pPr>
+            <w:r>
+              <w:rPr>
+                <w:rFonts w:ascii="Calibri" w:hAnsi="Calibri"/>
+                <w:b/>
+                <w:i w:val="0"/>
+                <w:color w:val="007A87"/>
+                <w:sz w:val="18"/>
+              </w:rPr>
+              <w:t>Set order</w:t>
+            </w:r>
+          </w:p>
+        </w:tc>
+        <w:tc>
+          <w:tcPr>
+            <w:tcW w:type="dxa" w:w="5832"/>
+            <w:shd w:val="clear" w:color="auto" w:fill="F0F6FA"/>
+            <w:vAlign w:val="center"/>
+          </w:tcPr>
+          <w:p>
+            <w:pPr>
+              <w:spacing w:before="20" w:after="20"/>
+              <w:jc w:val="center"/>
+            </w:pPr>
+            <w:r>
+              <w:rPr>
+                <w:rFonts w:ascii="Calibri" w:hAnsi="Calibri"/>
+                <w:b w:val="0"/>
+                <w:i w:val="0"/>
+                <w:color w:val="1A1A2E"/>
+                <w:sz w:val="18"/>
+              </w:rPr>
+              <w:t>あ, い, う, え, お</w:t>
+            </w:r>
+          </w:p>
+        </w:tc>
+      </w:tr>
+      <w:tr>
+        <w:tc>
+          <w:tcPr>
+            <w:tcW w:type="dxa" w:w="5832"/>
+            <w:shd w:val="clear" w:color="auto" w:fill="FFFFFF"/>
+            <w:vAlign w:val="center"/>
+          </w:tcPr>
+          <w:p>
+            <w:pPr>
+              <w:spacing w:before="20" w:after="20"/>
+            </w:pPr>
+            <w:r>
+              <w:rPr>
+                <w:rFonts w:ascii="Calibri" w:hAnsi="Calibri"/>
+                <w:b/>
+                <w:i w:val="0"/>
+                <w:color w:val="007A87"/>
+                <w:sz w:val="18"/>
+              </w:rPr>
+              <w:t>Sound order</w:t>
+            </w:r>
+          </w:p>
+        </w:tc>
+        <w:tc>
+          <w:tcPr>
+            <w:tcW w:type="dxa" w:w="5832"/>
+            <w:shd w:val="clear" w:color="auto" w:fill="FFFFFF"/>
+            <w:vAlign w:val="center"/>
+          </w:tcPr>
+          <w:p>
+            <w:pPr>
+              <w:spacing w:before="20" w:after="20"/>
+              <w:jc w:val="center"/>
+            </w:pPr>
+            <w:r>
+              <w:rPr>
+                <w:rFonts w:ascii="Calibri" w:hAnsi="Calibri"/>
+                <w:b w:val="0"/>
+                <w:i w:val="0"/>
+                <w:color w:val="1A1A2E"/>
+                <w:sz w:val="18"/>
+              </w:rPr>
+              <w:t>a, i, u, e, o</w:t>
+            </w:r>
+          </w:p>
+        </w:tc>
+      </w:tr>
+    </w:tbl>
     <w:sectPr>
       <w:footerReference w:type="default" r:id="rId9"/>
       <w:pgSz w:w="12240" w:h="15840"/>

</xml_diff>

<commit_message>
Expand hiragana worksheet practice units
Co-authored-by: sin-boo <sin-boo@users.noreply.github.com>
</commit_message>
<xml_diff>
--- a/japanese_docs/output/docs/hiragana_series/hira_01_vowels.docx
+++ b/japanese_docs/output/docs/hiragana_series/hira_01_vowels.docx
@@ -935,7 +935,17 @@
           <w:color w:val="1A1A2E"/>
           <w:sz w:val="16"/>
         </w:rPr>
-        <w:t>Fill in the missing kana to complete the row.</w:t>
+        <w:t xml:space="preserve">Fill in the missing kana to complete each pattern. </w:t>
+      </w:r>
+      <w:r>
+        <w:rPr>
+          <w:rFonts w:ascii="Calibri" w:hAnsi="Calibri"/>
+          <w:b/>
+          <w:i w:val="0"/>
+          <w:color w:val="007A87"/>
+          <w:sz w:val="16"/>
+        </w:rPr>
+        <w:t>Use the row order to help you.</w:t>
       </w:r>
     </w:p>
     <w:tbl>
@@ -1044,6 +1054,54 @@
           </w:p>
         </w:tc>
       </w:tr>
+      <w:tr>
+        <w:tc>
+          <w:tcPr>
+            <w:tcW w:type="dxa" w:w="5832"/>
+            <w:shd w:val="clear" w:color="auto" w:fill="FFFFFF"/>
+            <w:vAlign w:val="center"/>
+          </w:tcPr>
+          <w:p>
+            <w:pPr>
+              <w:spacing w:before="20" w:after="20"/>
+              <w:jc w:val="center"/>
+            </w:pPr>
+            <w:r>
+              <w:rPr>
+                <w:rFonts w:ascii="Calibri" w:hAnsi="Calibri"/>
+                <w:b/>
+                <w:i w:val="0"/>
+                <w:color w:val="1A3A5C"/>
+                <w:sz w:val="20"/>
+              </w:rPr>
+              <w:t>__  い  __  え  __</w:t>
+            </w:r>
+          </w:p>
+        </w:tc>
+        <w:tc>
+          <w:tcPr>
+            <w:tcW w:type="dxa" w:w="5832"/>
+            <w:shd w:val="clear" w:color="auto" w:fill="FFFFFF"/>
+            <w:vAlign w:val="center"/>
+          </w:tcPr>
+          <w:p>
+            <w:pPr>
+              <w:spacing w:before="20" w:after="20"/>
+              <w:jc w:val="center"/>
+            </w:pPr>
+            <w:r>
+              <w:rPr>
+                <w:rFonts w:ascii="Calibri" w:hAnsi="Calibri"/>
+                <w:b w:val="0"/>
+                <w:i w:val="0"/>
+                <w:color w:val="1A1A2E"/>
+                <w:sz w:val="16"/>
+              </w:rPr>
+              <w:t>__________________</w:t>
+            </w:r>
+          </w:p>
+        </w:tc>
+      </w:tr>
     </w:tbl>
     <w:p>
       <w:pPr>
@@ -1077,6 +1135,16 @@
           <w:b w:val="0"/>
           <w:i w:val="0"/>
           <w:color w:val="1A1A2E"/>
+          <w:sz w:val="16"/>
+        </w:rPr>
+        <w:t xml:space="preserve">Most kana in each line belong to this set. </w:t>
+      </w:r>
+      <w:r>
+        <w:rPr>
+          <w:rFonts w:ascii="Calibri" w:hAnsi="Calibri"/>
+          <w:b/>
+          <w:i w:val="0"/>
+          <w:color w:val="1A3A5C"/>
           <w:sz w:val="16"/>
         </w:rPr>
         <w:t>Write the one kana that does not belong.</w:t>
@@ -1236,6 +1304,54 @@
           </w:p>
         </w:tc>
       </w:tr>
+      <w:tr>
+        <w:tc>
+          <w:tcPr>
+            <w:tcW w:type="dxa" w:w="5832"/>
+            <w:shd w:val="clear" w:color="auto" w:fill="D4F1F4"/>
+            <w:vAlign w:val="center"/>
+          </w:tcPr>
+          <w:p>
+            <w:pPr>
+              <w:spacing w:before="20" w:after="20"/>
+              <w:jc w:val="center"/>
+            </w:pPr>
+            <w:r>
+              <w:rPr>
+                <w:rFonts w:ascii="Calibri" w:hAnsi="Calibri"/>
+                <w:b/>
+                <w:i w:val="0"/>
+                <w:color w:val="1A3A5C"/>
+                <w:sz w:val="20"/>
+              </w:rPr>
+              <w:t>う   え   く   お</w:t>
+            </w:r>
+          </w:p>
+        </w:tc>
+        <w:tc>
+          <w:tcPr>
+            <w:tcW w:type="dxa" w:w="5832"/>
+            <w:shd w:val="clear" w:color="auto" w:fill="D4F1F4"/>
+            <w:vAlign w:val="center"/>
+          </w:tcPr>
+          <w:p>
+            <w:pPr>
+              <w:spacing w:before="20" w:after="20"/>
+              <w:jc w:val="center"/>
+            </w:pPr>
+            <w:r>
+              <w:rPr>
+                <w:rFonts w:ascii="Calibri" w:hAnsi="Calibri"/>
+                <w:b w:val="0"/>
+                <w:i w:val="0"/>
+                <w:color w:val="1A1A2E"/>
+                <w:sz w:val="16"/>
+              </w:rPr>
+              <w:t>________</w:t>
+            </w:r>
+          </w:p>
+        </w:tc>
+      </w:tr>
     </w:tbl>
     <w:p>
       <w:pPr>
@@ -1271,7 +1387,47 @@
           <w:color w:val="1A1A2E"/>
           <w:sz w:val="16"/>
         </w:rPr>
-        <w:t>Write True or False for each sentence.</w:t>
+        <w:t xml:space="preserve">Read each sentence about the set and write </w:t>
+      </w:r>
+      <w:r>
+        <w:rPr>
+          <w:rFonts w:ascii="Calibri" w:hAnsi="Calibri"/>
+          <w:b/>
+          <w:i w:val="0"/>
+          <w:color w:val="007A87"/>
+          <w:sz w:val="16"/>
+        </w:rPr>
+        <w:t>True</w:t>
+      </w:r>
+      <w:r>
+        <w:rPr>
+          <w:rFonts w:ascii="Calibri" w:hAnsi="Calibri"/>
+          <w:b w:val="0"/>
+          <w:i w:val="0"/>
+          <w:color w:val="1A1A2E"/>
+          <w:sz w:val="16"/>
+        </w:rPr>
+        <w:t xml:space="preserve"> or </w:t>
+      </w:r>
+      <w:r>
+        <w:rPr>
+          <w:rFonts w:ascii="Calibri" w:hAnsi="Calibri"/>
+          <w:b/>
+          <w:i w:val="0"/>
+          <w:color w:val="1A3A5C"/>
+          <w:sz w:val="16"/>
+        </w:rPr>
+        <w:t>False</w:t>
+      </w:r>
+      <w:r>
+        <w:rPr>
+          <w:rFonts w:ascii="Calibri" w:hAnsi="Calibri"/>
+          <w:b w:val="0"/>
+          <w:i w:val="0"/>
+          <w:color w:val="1A1A2E"/>
+          <w:sz w:val="16"/>
+        </w:rPr>
+        <w:t>.</w:t>
       </w:r>
     </w:p>
     <w:tbl>
@@ -1406,6 +1562,53 @@
           <w:tcPr>
             <w:tcW w:type="dxa" w:w="5832"/>
             <w:shd w:val="clear" w:color="auto" w:fill="FFFFFF"/>
+            <w:vAlign w:val="center"/>
+          </w:tcPr>
+          <w:p>
+            <w:pPr>
+              <w:spacing w:before="20" w:after="20"/>
+              <w:jc w:val="center"/>
+            </w:pPr>
+            <w:r>
+              <w:rPr>
+                <w:rFonts w:ascii="Calibri" w:hAnsi="Calibri"/>
+                <w:b w:val="0"/>
+                <w:i w:val="0"/>
+                <w:color w:val="1A1A2E"/>
+                <w:sz w:val="16"/>
+              </w:rPr>
+              <w:t>________</w:t>
+            </w:r>
+          </w:p>
+        </w:tc>
+      </w:tr>
+      <w:tr>
+        <w:tc>
+          <w:tcPr>
+            <w:tcW w:type="dxa" w:w="5832"/>
+            <w:shd w:val="clear" w:color="auto" w:fill="F0F6FA"/>
+            <w:vAlign w:val="center"/>
+          </w:tcPr>
+          <w:p>
+            <w:pPr>
+              <w:spacing w:before="20" w:after="20"/>
+            </w:pPr>
+            <w:r>
+              <w:rPr>
+                <w:rFonts w:ascii="Calibri" w:hAnsi="Calibri"/>
+                <w:b w:val="0"/>
+                <w:i w:val="0"/>
+                <w:color w:val="1A1A2E"/>
+                <w:sz w:val="14"/>
+              </w:rPr>
+              <w:t>The last sound in this set is o.</w:t>
+            </w:r>
+          </w:p>
+        </w:tc>
+        <w:tc>
+          <w:tcPr>
+            <w:tcW w:type="dxa" w:w="5832"/>
+            <w:shd w:val="clear" w:color="auto" w:fill="F0F6FA"/>
             <w:vAlign w:val="center"/>
           </w:tcPr>
           <w:p>
@@ -2183,6 +2386,54 @@
           </w:p>
         </w:tc>
       </w:tr>
+      <w:tr>
+        <w:tc>
+          <w:tcPr>
+            <w:tcW w:type="dxa" w:w="5832"/>
+            <w:shd w:val="clear" w:color="auto" w:fill="FFFFFF"/>
+            <w:vAlign w:val="center"/>
+          </w:tcPr>
+          <w:p>
+            <w:pPr>
+              <w:spacing w:before="20" w:after="20"/>
+              <w:jc w:val="center"/>
+            </w:pPr>
+            <w:r>
+              <w:rPr>
+                <w:rFonts w:ascii="Calibri" w:hAnsi="Calibri"/>
+                <w:b/>
+                <w:i w:val="0"/>
+                <w:color w:val="1A3A5C"/>
+                <w:sz w:val="20"/>
+              </w:rPr>
+              <w:t>__  い  __  え  __</w:t>
+            </w:r>
+          </w:p>
+        </w:tc>
+        <w:tc>
+          <w:tcPr>
+            <w:tcW w:type="dxa" w:w="5832"/>
+            <w:shd w:val="clear" w:color="auto" w:fill="FFFFFF"/>
+            <w:vAlign w:val="center"/>
+          </w:tcPr>
+          <w:p>
+            <w:pPr>
+              <w:spacing w:before="20" w:after="20"/>
+              <w:jc w:val="center"/>
+            </w:pPr>
+            <w:r>
+              <w:rPr>
+                <w:rFonts w:ascii="Calibri" w:hAnsi="Calibri"/>
+                <w:b w:val="0"/>
+                <w:i w:val="0"/>
+                <w:color w:val="1A1A2E"/>
+                <w:sz w:val="18"/>
+              </w:rPr>
+              <w:t>あ, う, お</w:t>
+            </w:r>
+          </w:p>
+        </w:tc>
+      </w:tr>
     </w:tbl>
     <w:p>
       <w:pPr>
@@ -2356,6 +2607,54 @@
                 <w:sz w:val="18"/>
               </w:rPr>
               <w:t>き</w:t>
+            </w:r>
+          </w:p>
+        </w:tc>
+      </w:tr>
+      <w:tr>
+        <w:tc>
+          <w:tcPr>
+            <w:tcW w:type="dxa" w:w="5832"/>
+            <w:shd w:val="clear" w:color="auto" w:fill="D4F1F4"/>
+            <w:vAlign w:val="center"/>
+          </w:tcPr>
+          <w:p>
+            <w:pPr>
+              <w:spacing w:before="20" w:after="20"/>
+              <w:jc w:val="center"/>
+            </w:pPr>
+            <w:r>
+              <w:rPr>
+                <w:rFonts w:ascii="Calibri" w:hAnsi="Calibri"/>
+                <w:b/>
+                <w:i w:val="0"/>
+                <w:color w:val="1A3A5C"/>
+                <w:sz w:val="20"/>
+              </w:rPr>
+              <w:t>う   え   く   お</w:t>
+            </w:r>
+          </w:p>
+        </w:tc>
+        <w:tc>
+          <w:tcPr>
+            <w:tcW w:type="dxa" w:w="5832"/>
+            <w:shd w:val="clear" w:color="auto" w:fill="D4F1F4"/>
+            <w:vAlign w:val="center"/>
+          </w:tcPr>
+          <w:p>
+            <w:pPr>
+              <w:spacing w:before="20" w:after="20"/>
+              <w:jc w:val="center"/>
+            </w:pPr>
+            <w:r>
+              <w:rPr>
+                <w:rFonts w:ascii="Calibri" w:hAnsi="Calibri"/>
+                <w:b w:val="0"/>
+                <w:i w:val="0"/>
+                <w:color w:val="1A1A2E"/>
+                <w:sz w:val="18"/>
+              </w:rPr>
+              <w:t>く</w:t>
             </w:r>
           </w:p>
         </w:tc>
@@ -2535,6 +2834,53 @@
           </w:p>
         </w:tc>
       </w:tr>
+      <w:tr>
+        <w:tc>
+          <w:tcPr>
+            <w:tcW w:type="dxa" w:w="5832"/>
+            <w:shd w:val="clear" w:color="auto" w:fill="F0F6FA"/>
+            <w:vAlign w:val="center"/>
+          </w:tcPr>
+          <w:p>
+            <w:pPr>
+              <w:spacing w:before="20" w:after="20"/>
+            </w:pPr>
+            <w:r>
+              <w:rPr>
+                <w:rFonts w:ascii="Calibri" w:hAnsi="Calibri"/>
+                <w:b w:val="0"/>
+                <w:i w:val="0"/>
+                <w:color w:val="1A1A2E"/>
+                <w:sz w:val="16"/>
+              </w:rPr>
+              <w:t>The last sound in this set is o.</w:t>
+            </w:r>
+          </w:p>
+        </w:tc>
+        <w:tc>
+          <w:tcPr>
+            <w:tcW w:type="dxa" w:w="5832"/>
+            <w:shd w:val="clear" w:color="auto" w:fill="F0F6FA"/>
+            <w:vAlign w:val="center"/>
+          </w:tcPr>
+          <w:p>
+            <w:pPr>
+              <w:spacing w:before="20" w:after="20"/>
+              <w:jc w:val="center"/>
+            </w:pPr>
+            <w:r>
+              <w:rPr>
+                <w:rFonts w:ascii="Calibri" w:hAnsi="Calibri"/>
+                <w:b/>
+                <w:i w:val="0"/>
+                <w:color w:val="007A87"/>
+                <w:sz w:val="18"/>
+              </w:rPr>
+              <w:t>True</w:t>
+            </w:r>
+          </w:p>
+        </w:tc>
+      </w:tr>
     </w:tbl>
     <w:p>
       <w:pPr>
@@ -2662,129 +3008,30 @@
     </w:p>
     <w:p>
       <w:pPr>
-        <w:spacing w:after="0"/>
-      </w:pPr>
-    </w:p>
-    <w:p>
-      <w:pPr>
-        <w:spacing w:before="80" w:after="40"/>
+        <w:spacing w:before="0" w:after="0"/>
+        <w:ind w:left="340"/>
       </w:pPr>
       <w:r>
         <w:rPr>
           <w:rFonts w:ascii="Calibri" w:hAnsi="Calibri"/>
           <w:b/>
           <w:i w:val="0"/>
-          <w:color w:val="007A87"/>
-          <w:sz w:val="24"/>
+          <w:color w:val="E6A817"/>
+          <w:sz w:val="18"/>
         </w:rPr>
-        <w:t>Memory helper</w:t>
+        <w:t xml:space="preserve">▸ </w:t>
+      </w:r>
+      <w:r>
+        <w:rPr>
+          <w:rFonts w:ascii="Calibri" w:hAnsi="Calibri"/>
+          <w:b w:val="0"/>
+          <w:i w:val="0"/>
+          <w:color w:val="1A1A2E"/>
+          <w:sz w:val="18"/>
+        </w:rPr>
+        <w:t>Set order: あ, い, う, え, お | Sound order: a, i, u, e, o</w:t>
       </w:r>
     </w:p>
-    <w:tbl>
-      <w:tblPr>
-        <w:tblStyle w:val="TableGrid"/>
-        <w:tblW w:type="auto" w:w="0"/>
-        <w:tblLook w:firstColumn="1" w:firstRow="1" w:lastColumn="0" w:lastRow="0" w:noHBand="0" w:noVBand="1" w:val="04A0"/>
-      </w:tblPr>
-      <w:tblGrid>
-        <w:gridCol w:w="5832"/>
-        <w:gridCol w:w="5832"/>
-      </w:tblGrid>
-      <w:tr>
-        <w:tc>
-          <w:tcPr>
-            <w:tcW w:type="dxa" w:w="5832"/>
-            <w:shd w:val="clear" w:color="auto" w:fill="F0F6FA"/>
-            <w:vAlign w:val="center"/>
-          </w:tcPr>
-          <w:p>
-            <w:pPr>
-              <w:spacing w:before="20" w:after="20"/>
-            </w:pPr>
-            <w:r>
-              <w:rPr>
-                <w:rFonts w:ascii="Calibri" w:hAnsi="Calibri"/>
-                <w:b/>
-                <w:i w:val="0"/>
-                <w:color w:val="007A87"/>
-                <w:sz w:val="18"/>
-              </w:rPr>
-              <w:t>Set order</w:t>
-            </w:r>
-          </w:p>
-        </w:tc>
-        <w:tc>
-          <w:tcPr>
-            <w:tcW w:type="dxa" w:w="5832"/>
-            <w:shd w:val="clear" w:color="auto" w:fill="F0F6FA"/>
-            <w:vAlign w:val="center"/>
-          </w:tcPr>
-          <w:p>
-            <w:pPr>
-              <w:spacing w:before="20" w:after="20"/>
-              <w:jc w:val="center"/>
-            </w:pPr>
-            <w:r>
-              <w:rPr>
-                <w:rFonts w:ascii="Calibri" w:hAnsi="Calibri"/>
-                <w:b w:val="0"/>
-                <w:i w:val="0"/>
-                <w:color w:val="1A1A2E"/>
-                <w:sz w:val="18"/>
-              </w:rPr>
-              <w:t>あ, い, う, え, お</w:t>
-            </w:r>
-          </w:p>
-        </w:tc>
-      </w:tr>
-      <w:tr>
-        <w:tc>
-          <w:tcPr>
-            <w:tcW w:type="dxa" w:w="5832"/>
-            <w:shd w:val="clear" w:color="auto" w:fill="FFFFFF"/>
-            <w:vAlign w:val="center"/>
-          </w:tcPr>
-          <w:p>
-            <w:pPr>
-              <w:spacing w:before="20" w:after="20"/>
-            </w:pPr>
-            <w:r>
-              <w:rPr>
-                <w:rFonts w:ascii="Calibri" w:hAnsi="Calibri"/>
-                <w:b/>
-                <w:i w:val="0"/>
-                <w:color w:val="007A87"/>
-                <w:sz w:val="18"/>
-              </w:rPr>
-              <w:t>Sound order</w:t>
-            </w:r>
-          </w:p>
-        </w:tc>
-        <w:tc>
-          <w:tcPr>
-            <w:tcW w:type="dxa" w:w="5832"/>
-            <w:shd w:val="clear" w:color="auto" w:fill="FFFFFF"/>
-            <w:vAlign w:val="center"/>
-          </w:tcPr>
-          <w:p>
-            <w:pPr>
-              <w:spacing w:before="20" w:after="20"/>
-              <w:jc w:val="center"/>
-            </w:pPr>
-            <w:r>
-              <w:rPr>
-                <w:rFonts w:ascii="Calibri" w:hAnsi="Calibri"/>
-                <w:b w:val="0"/>
-                <w:i w:val="0"/>
-                <w:color w:val="1A1A2E"/>
-                <w:sz w:val="18"/>
-              </w:rPr>
-              <w:t>a, i, u, e, o</w:t>
-            </w:r>
-          </w:p>
-        </w:tc>
-      </w:tr>
-    </w:tbl>
     <w:sectPr>
       <w:footerReference w:type="default" r:id="rId9"/>
       <w:pgSz w:w="12240" w:h="15840"/>

</xml_diff>

<commit_message>
Add more questions to hiragana worksheet units
Co-authored-by: sin-boo <sin-boo@users.noreply.github.com>
</commit_message>
<xml_diff>
--- a/japanese_docs/output/docs/hiragana_series/hira_01_vowels.docx
+++ b/japanese_docs/output/docs/hiragana_series/hira_01_vowels.docx
@@ -879,6 +879,282 @@
     </w:tbl>
     <w:p>
       <w:pPr>
+        <w:spacing w:before="0" w:after="20"/>
+      </w:pPr>
+      <w:r>
+        <w:rPr>
+          <w:rFonts w:ascii="Calibri" w:hAnsi="Calibri"/>
+          <w:b w:val="0"/>
+          <w:i w:val="0"/>
+          <w:color w:val="1A1A2E"/>
+          <w:sz w:val="16"/>
+        </w:rPr>
+        <w:t xml:space="preserve">Now do the reverse. </w:t>
+      </w:r>
+      <w:r>
+        <w:rPr>
+          <w:rFonts w:ascii="Calibri" w:hAnsi="Calibri"/>
+          <w:b/>
+          <w:i w:val="0"/>
+          <w:color w:val="007A87"/>
+          <w:sz w:val="16"/>
+        </w:rPr>
+        <w:t>Write the kana that matches each sound.</w:t>
+      </w:r>
+    </w:p>
+    <w:tbl>
+      <w:tblPr>
+        <w:tblStyle w:val="TableGrid"/>
+        <w:tblW w:type="auto" w:w="0"/>
+        <w:tblLook w:firstColumn="1" w:firstRow="1" w:lastColumn="0" w:lastRow="0" w:noHBand="0" w:noVBand="1" w:val="04A0"/>
+      </w:tblPr>
+      <w:tblGrid>
+        <w:gridCol w:w="5832"/>
+        <w:gridCol w:w="5832"/>
+      </w:tblGrid>
+      <w:tr>
+        <w:tc>
+          <w:tcPr>
+            <w:tcW w:type="dxa" w:w="5832"/>
+            <w:shd w:val="clear" w:color="auto" w:fill="007A87"/>
+            <w:vAlign w:val="center"/>
+          </w:tcPr>
+          <w:p>
+            <w:pPr>
+              <w:spacing w:before="20" w:after="20"/>
+              <w:jc w:val="center"/>
+            </w:pPr>
+            <w:r>
+              <w:rPr>
+                <w:rFonts w:ascii="Calibri" w:hAnsi="Calibri"/>
+                <w:b/>
+                <w:i w:val="0"/>
+                <w:color w:val="FFFFFF"/>
+                <w:sz w:val="16"/>
+              </w:rPr>
+              <w:t>Sound</w:t>
+            </w:r>
+          </w:p>
+        </w:tc>
+        <w:tc>
+          <w:tcPr>
+            <w:tcW w:type="dxa" w:w="5832"/>
+            <w:shd w:val="clear" w:color="auto" w:fill="007A87"/>
+            <w:vAlign w:val="center"/>
+          </w:tcPr>
+          <w:p>
+            <w:pPr>
+              <w:spacing w:before="20" w:after="20"/>
+              <w:jc w:val="center"/>
+            </w:pPr>
+            <w:r>
+              <w:rPr>
+                <w:rFonts w:ascii="Calibri" w:hAnsi="Calibri"/>
+                <w:b/>
+                <w:i w:val="0"/>
+                <w:color w:val="FFFFFF"/>
+                <w:sz w:val="16"/>
+              </w:rPr>
+              <w:t>Write the kana</w:t>
+            </w:r>
+          </w:p>
+        </w:tc>
+      </w:tr>
+      <w:tr>
+        <w:tc>
+          <w:tcPr>
+            <w:tcW w:type="dxa" w:w="5832"/>
+            <w:shd w:val="clear" w:color="auto" w:fill="F0F6FA"/>
+            <w:vAlign w:val="center"/>
+          </w:tcPr>
+          <w:p>
+            <w:pPr>
+              <w:spacing w:before="20" w:after="20"/>
+              <w:jc w:val="center"/>
+            </w:pPr>
+            <w:r>
+              <w:rPr>
+                <w:rFonts w:ascii="Calibri" w:hAnsi="Calibri"/>
+                <w:b/>
+                <w:i w:val="0"/>
+                <w:color w:val="1A3A5C"/>
+                <w:sz w:val="18"/>
+              </w:rPr>
+              <w:t>i</w:t>
+            </w:r>
+          </w:p>
+        </w:tc>
+        <w:tc>
+          <w:tcPr>
+            <w:tcW w:type="dxa" w:w="5832"/>
+            <w:shd w:val="clear" w:color="auto" w:fill="F0F6FA"/>
+            <w:vAlign w:val="center"/>
+          </w:tcPr>
+          <w:p>
+            <w:pPr>
+              <w:spacing w:before="20" w:after="20"/>
+              <w:jc w:val="center"/>
+            </w:pPr>
+            <w:r>
+              <w:rPr>
+                <w:rFonts w:ascii="Calibri" w:hAnsi="Calibri"/>
+                <w:b w:val="0"/>
+                <w:i w:val="0"/>
+                <w:color w:val="1A1A2E"/>
+                <w:sz w:val="16"/>
+              </w:rPr>
+              <w:t>________</w:t>
+            </w:r>
+          </w:p>
+        </w:tc>
+      </w:tr>
+      <w:tr>
+        <w:tc>
+          <w:tcPr>
+            <w:tcW w:type="dxa" w:w="5832"/>
+            <w:shd w:val="clear" w:color="auto" w:fill="FFFFFF"/>
+            <w:vAlign w:val="center"/>
+          </w:tcPr>
+          <w:p>
+            <w:pPr>
+              <w:spacing w:before="20" w:after="20"/>
+              <w:jc w:val="center"/>
+            </w:pPr>
+            <w:r>
+              <w:rPr>
+                <w:rFonts w:ascii="Calibri" w:hAnsi="Calibri"/>
+                <w:b/>
+                <w:i w:val="0"/>
+                <w:color w:val="1A3A5C"/>
+                <w:sz w:val="18"/>
+              </w:rPr>
+              <w:t>e</w:t>
+            </w:r>
+          </w:p>
+        </w:tc>
+        <w:tc>
+          <w:tcPr>
+            <w:tcW w:type="dxa" w:w="5832"/>
+            <w:shd w:val="clear" w:color="auto" w:fill="FFFFFF"/>
+            <w:vAlign w:val="center"/>
+          </w:tcPr>
+          <w:p>
+            <w:pPr>
+              <w:spacing w:before="20" w:after="20"/>
+              <w:jc w:val="center"/>
+            </w:pPr>
+            <w:r>
+              <w:rPr>
+                <w:rFonts w:ascii="Calibri" w:hAnsi="Calibri"/>
+                <w:b w:val="0"/>
+                <w:i w:val="0"/>
+                <w:color w:val="1A1A2E"/>
+                <w:sz w:val="16"/>
+              </w:rPr>
+              <w:t>________</w:t>
+            </w:r>
+          </w:p>
+        </w:tc>
+      </w:tr>
+      <w:tr>
+        <w:tc>
+          <w:tcPr>
+            <w:tcW w:type="dxa" w:w="5832"/>
+            <w:shd w:val="clear" w:color="auto" w:fill="F0F6FA"/>
+            <w:vAlign w:val="center"/>
+          </w:tcPr>
+          <w:p>
+            <w:pPr>
+              <w:spacing w:before="20" w:after="20"/>
+              <w:jc w:val="center"/>
+            </w:pPr>
+            <w:r>
+              <w:rPr>
+                <w:rFonts w:ascii="Calibri" w:hAnsi="Calibri"/>
+                <w:b/>
+                <w:i w:val="0"/>
+                <w:color w:val="1A3A5C"/>
+                <w:sz w:val="18"/>
+              </w:rPr>
+              <w:t>a</w:t>
+            </w:r>
+          </w:p>
+        </w:tc>
+        <w:tc>
+          <w:tcPr>
+            <w:tcW w:type="dxa" w:w="5832"/>
+            <w:shd w:val="clear" w:color="auto" w:fill="F0F6FA"/>
+            <w:vAlign w:val="center"/>
+          </w:tcPr>
+          <w:p>
+            <w:pPr>
+              <w:spacing w:before="20" w:after="20"/>
+              <w:jc w:val="center"/>
+            </w:pPr>
+            <w:r>
+              <w:rPr>
+                <w:rFonts w:ascii="Calibri" w:hAnsi="Calibri"/>
+                <w:b w:val="0"/>
+                <w:i w:val="0"/>
+                <w:color w:val="1A1A2E"/>
+                <w:sz w:val="16"/>
+              </w:rPr>
+              <w:t>________</w:t>
+            </w:r>
+          </w:p>
+        </w:tc>
+      </w:tr>
+      <w:tr>
+        <w:tc>
+          <w:tcPr>
+            <w:tcW w:type="dxa" w:w="5832"/>
+            <w:shd w:val="clear" w:color="auto" w:fill="FFFFFF"/>
+            <w:vAlign w:val="center"/>
+          </w:tcPr>
+          <w:p>
+            <w:pPr>
+              <w:spacing w:before="20" w:after="20"/>
+              <w:jc w:val="center"/>
+            </w:pPr>
+            <w:r>
+              <w:rPr>
+                <w:rFonts w:ascii="Calibri" w:hAnsi="Calibri"/>
+                <w:b/>
+                <w:i w:val="0"/>
+                <w:color w:val="1A3A5C"/>
+                <w:sz w:val="18"/>
+              </w:rPr>
+              <w:t>o</w:t>
+            </w:r>
+          </w:p>
+        </w:tc>
+        <w:tc>
+          <w:tcPr>
+            <w:tcW w:type="dxa" w:w="5832"/>
+            <w:shd w:val="clear" w:color="auto" w:fill="FFFFFF"/>
+            <w:vAlign w:val="center"/>
+          </w:tcPr>
+          <w:p>
+            <w:pPr>
+              <w:spacing w:before="20" w:after="20"/>
+              <w:jc w:val="center"/>
+            </w:pPr>
+            <w:r>
+              <w:rPr>
+                <w:rFonts w:ascii="Calibri" w:hAnsi="Calibri"/>
+                <w:b w:val="0"/>
+                <w:i w:val="0"/>
+                <w:color w:val="1A1A2E"/>
+                <w:sz w:val="16"/>
+              </w:rPr>
+              <w:t>________</w:t>
+            </w:r>
+          </w:p>
+        </w:tc>
+      </w:tr>
+    </w:tbl>
+    <w:p>
+      <w:pPr>
         <w:spacing w:before="0" w:after="0"/>
       </w:pPr>
       <w:r>
@@ -1082,6 +1358,54 @@
           <w:tcPr>
             <w:tcW w:type="dxa" w:w="5832"/>
             <w:shd w:val="clear" w:color="auto" w:fill="FFFFFF"/>
+            <w:vAlign w:val="center"/>
+          </w:tcPr>
+          <w:p>
+            <w:pPr>
+              <w:spacing w:before="20" w:after="20"/>
+              <w:jc w:val="center"/>
+            </w:pPr>
+            <w:r>
+              <w:rPr>
+                <w:rFonts w:ascii="Calibri" w:hAnsi="Calibri"/>
+                <w:b w:val="0"/>
+                <w:i w:val="0"/>
+                <w:color w:val="1A1A2E"/>
+                <w:sz w:val="16"/>
+              </w:rPr>
+              <w:t>__________________</w:t>
+            </w:r>
+          </w:p>
+        </w:tc>
+      </w:tr>
+      <w:tr>
+        <w:tc>
+          <w:tcPr>
+            <w:tcW w:type="dxa" w:w="5832"/>
+            <w:shd w:val="clear" w:color="auto" w:fill="F0F6FA"/>
+            <w:vAlign w:val="center"/>
+          </w:tcPr>
+          <w:p>
+            <w:pPr>
+              <w:spacing w:before="20" w:after="20"/>
+              <w:jc w:val="center"/>
+            </w:pPr>
+            <w:r>
+              <w:rPr>
+                <w:rFonts w:ascii="Calibri" w:hAnsi="Calibri"/>
+                <w:b/>
+                <w:i w:val="0"/>
+                <w:color w:val="1A3A5C"/>
+                <w:sz w:val="20"/>
+              </w:rPr>
+              <w:t>お  __  う  __  あ</w:t>
+            </w:r>
+          </w:p>
+        </w:tc>
+        <w:tc>
+          <w:tcPr>
+            <w:tcW w:type="dxa" w:w="5832"/>
+            <w:shd w:val="clear" w:color="auto" w:fill="F0F6FA"/>
             <w:vAlign w:val="center"/>
           </w:tcPr>
           <w:p>
@@ -1332,6 +1656,54 @@
           <w:tcPr>
             <w:tcW w:type="dxa" w:w="5832"/>
             <w:shd w:val="clear" w:color="auto" w:fill="D4F1F4"/>
+            <w:vAlign w:val="center"/>
+          </w:tcPr>
+          <w:p>
+            <w:pPr>
+              <w:spacing w:before="20" w:after="20"/>
+              <w:jc w:val="center"/>
+            </w:pPr>
+            <w:r>
+              <w:rPr>
+                <w:rFonts w:ascii="Calibri" w:hAnsi="Calibri"/>
+                <w:b w:val="0"/>
+                <w:i w:val="0"/>
+                <w:color w:val="1A1A2E"/>
+                <w:sz w:val="16"/>
+              </w:rPr>
+              <w:t>________</w:t>
+            </w:r>
+          </w:p>
+        </w:tc>
+      </w:tr>
+      <w:tr>
+        <w:tc>
+          <w:tcPr>
+            <w:tcW w:type="dxa" w:w="5832"/>
+            <w:shd w:val="clear" w:color="auto" w:fill="FFFFFF"/>
+            <w:vAlign w:val="center"/>
+          </w:tcPr>
+          <w:p>
+            <w:pPr>
+              <w:spacing w:before="20" w:after="20"/>
+              <w:jc w:val="center"/>
+            </w:pPr>
+            <w:r>
+              <w:rPr>
+                <w:rFonts w:ascii="Calibri" w:hAnsi="Calibri"/>
+                <w:b/>
+                <w:i w:val="0"/>
+                <w:color w:val="1A3A5C"/>
+                <w:sz w:val="20"/>
+              </w:rPr>
+              <w:t>お   あ   か   う</w:t>
+            </w:r>
+          </w:p>
+        </w:tc>
+        <w:tc>
+          <w:tcPr>
+            <w:tcW w:type="dxa" w:w="5832"/>
+            <w:shd w:val="clear" w:color="auto" w:fill="FFFFFF"/>
             <w:vAlign w:val="center"/>
           </w:tcPr>
           <w:p>
@@ -1629,6 +2001,53 @@
           </w:p>
         </w:tc>
       </w:tr>
+      <w:tr>
+        <w:tc>
+          <w:tcPr>
+            <w:tcW w:type="dxa" w:w="5832"/>
+            <w:shd w:val="clear" w:color="auto" w:fill="FFFFFF"/>
+            <w:vAlign w:val="center"/>
+          </w:tcPr>
+          <w:p>
+            <w:pPr>
+              <w:spacing w:before="20" w:after="20"/>
+            </w:pPr>
+            <w:r>
+              <w:rPr>
+                <w:rFonts w:ascii="Calibri" w:hAnsi="Calibri"/>
+                <w:b w:val="0"/>
+                <w:i w:val="0"/>
+                <w:color w:val="1A1A2E"/>
+                <w:sz w:val="14"/>
+              </w:rPr>
+              <w:t>The first sound in this set is a.</w:t>
+            </w:r>
+          </w:p>
+        </w:tc>
+        <w:tc>
+          <w:tcPr>
+            <w:tcW w:type="dxa" w:w="5832"/>
+            <w:shd w:val="clear" w:color="auto" w:fill="FFFFFF"/>
+            <w:vAlign w:val="center"/>
+          </w:tcPr>
+          <w:p>
+            <w:pPr>
+              <w:spacing w:before="20" w:after="20"/>
+              <w:jc w:val="center"/>
+            </w:pPr>
+            <w:r>
+              <w:rPr>
+                <w:rFonts w:ascii="Calibri" w:hAnsi="Calibri"/>
+                <w:b w:val="0"/>
+                <w:i w:val="0"/>
+                <w:color w:val="1A1A2E"/>
+                <w:sz w:val="16"/>
+              </w:rPr>
+              <w:t>________</w:t>
+            </w:r>
+          </w:p>
+        </w:tc>
+      </w:tr>
     </w:tbl>
     <w:p>
       <w:pPr>
@@ -1762,7 +2181,7 @@
                 <w:b/>
                 <w:i w:val="0"/>
                 <w:color w:val="1A3A5C"/>
-                <w:sz w:val="24"/>
+                <w:sz w:val="22"/>
               </w:rPr>
               <w:t>あい</w:t>
             </w:r>
@@ -1785,7 +2204,7 @@
                 <w:b w:val="0"/>
                 <w:i w:val="0"/>
                 <w:color w:val="1A1A2E"/>
-                <w:sz w:val="18"/>
+                <w:sz w:val="16"/>
               </w:rPr>
               <w:t>a-i</w:t>
             </w:r>
@@ -1810,7 +2229,7 @@
                 <w:b/>
                 <w:i w:val="0"/>
                 <w:color w:val="1A3A5C"/>
-                <w:sz w:val="24"/>
+                <w:sz w:val="22"/>
               </w:rPr>
               <w:t>うえ</w:t>
             </w:r>
@@ -1833,7 +2252,7 @@
                 <w:b w:val="0"/>
                 <w:i w:val="0"/>
                 <w:color w:val="1A1A2E"/>
-                <w:sz w:val="18"/>
+                <w:sz w:val="16"/>
               </w:rPr>
               <w:t>u-e</w:t>
             </w:r>
@@ -1844,96 +2263,28 @@
         <w:tc>
           <w:tcPr>
             <w:tcW w:type="dxa" w:w="5832"/>
-            <w:shd w:val="clear" w:color="auto" w:fill="F0F6FA"/>
-            <w:vAlign w:val="center"/>
           </w:tcPr>
-          <w:p>
-            <w:pPr>
-              <w:spacing w:before="20" w:after="20"/>
-              <w:jc w:val="center"/>
-            </w:pPr>
-            <w:r>
-              <w:rPr>
-                <w:rFonts w:ascii="Calibri" w:hAnsi="Calibri"/>
-                <w:b/>
-                <w:i w:val="0"/>
-                <w:color w:val="1A3A5C"/>
-                <w:sz w:val="24"/>
-              </w:rPr>
-              <w:t>あお</w:t>
-            </w:r>
-          </w:p>
+          <w:p/>
         </w:tc>
         <w:tc>
           <w:tcPr>
             <w:tcW w:type="dxa" w:w="5832"/>
-            <w:shd w:val="clear" w:color="auto" w:fill="F0F6FA"/>
-            <w:vAlign w:val="center"/>
           </w:tcPr>
-          <w:p>
-            <w:pPr>
-              <w:spacing w:before="20" w:after="20"/>
-              <w:jc w:val="center"/>
-            </w:pPr>
-            <w:r>
-              <w:rPr>
-                <w:rFonts w:ascii="Calibri" w:hAnsi="Calibri"/>
-                <w:b w:val="0"/>
-                <w:i w:val="0"/>
-                <w:color w:val="1A1A2E"/>
-                <w:sz w:val="18"/>
-              </w:rPr>
-              <w:t>a-o</w:t>
-            </w:r>
-          </w:p>
+          <w:p/>
         </w:tc>
       </w:tr>
       <w:tr>
         <w:tc>
           <w:tcPr>
             <w:tcW w:type="dxa" w:w="5832"/>
-            <w:shd w:val="clear" w:color="auto" w:fill="FFFFFF"/>
-            <w:vAlign w:val="center"/>
           </w:tcPr>
-          <w:p>
-            <w:pPr>
-              <w:spacing w:before="20" w:after="20"/>
-              <w:jc w:val="center"/>
-            </w:pPr>
-            <w:r>
-              <w:rPr>
-                <w:rFonts w:ascii="Calibri" w:hAnsi="Calibri"/>
-                <w:b/>
-                <w:i w:val="0"/>
-                <w:color w:val="1A3A5C"/>
-                <w:sz w:val="24"/>
-              </w:rPr>
-              <w:t>いえ</w:t>
-            </w:r>
-          </w:p>
+          <w:p/>
         </w:tc>
         <w:tc>
           <w:tcPr>
             <w:tcW w:type="dxa" w:w="5832"/>
-            <w:shd w:val="clear" w:color="auto" w:fill="FFFFFF"/>
-            <w:vAlign w:val="center"/>
           </w:tcPr>
-          <w:p>
-            <w:pPr>
-              <w:spacing w:before="20" w:after="20"/>
-              <w:jc w:val="center"/>
-            </w:pPr>
-            <w:r>
-              <w:rPr>
-                <w:rFonts w:ascii="Calibri" w:hAnsi="Calibri"/>
-                <w:b w:val="0"/>
-                <w:i w:val="0"/>
-                <w:color w:val="1A1A2E"/>
-                <w:sz w:val="18"/>
-              </w:rPr>
-              <w:t>i-e</w:t>
-            </w:r>
-          </w:p>
+          <w:p/>
         </w:tc>
       </w:tr>
     </w:tbl>
@@ -2263,6 +2614,262 @@
         <w:spacing w:after="0"/>
       </w:pPr>
     </w:p>
+    <w:tbl>
+      <w:tblPr>
+        <w:tblStyle w:val="TableGrid"/>
+        <w:tblW w:type="auto" w:w="0"/>
+        <w:tblLook w:firstColumn="1" w:firstRow="1" w:lastColumn="0" w:lastRow="0" w:noHBand="0" w:noVBand="1" w:val="04A0"/>
+      </w:tblPr>
+      <w:tblGrid>
+        <w:gridCol w:w="5832"/>
+        <w:gridCol w:w="5832"/>
+      </w:tblGrid>
+      <w:tr>
+        <w:tc>
+          <w:tcPr>
+            <w:tcW w:type="dxa" w:w="5832"/>
+            <w:shd w:val="clear" w:color="auto" w:fill="F0F6FA"/>
+            <w:vAlign w:val="center"/>
+          </w:tcPr>
+          <w:p>
+            <w:pPr>
+              <w:spacing w:before="20" w:after="20"/>
+              <w:jc w:val="center"/>
+            </w:pPr>
+            <w:r>
+              <w:rPr>
+                <w:rFonts w:ascii="Calibri" w:hAnsi="Calibri"/>
+                <w:b/>
+                <w:i w:val="0"/>
+                <w:color w:val="1A3A5C"/>
+                <w:sz w:val="16"/>
+              </w:rPr>
+              <w:t>Sound</w:t>
+            </w:r>
+          </w:p>
+        </w:tc>
+        <w:tc>
+          <w:tcPr>
+            <w:tcW w:type="dxa" w:w="5832"/>
+            <w:shd w:val="clear" w:color="auto" w:fill="F0F6FA"/>
+            <w:vAlign w:val="center"/>
+          </w:tcPr>
+          <w:p>
+            <w:pPr>
+              <w:spacing w:before="20" w:after="20"/>
+              <w:jc w:val="center"/>
+            </w:pPr>
+            <w:r>
+              <w:rPr>
+                <w:rFonts w:ascii="Calibri" w:hAnsi="Calibri"/>
+                <w:b/>
+                <w:i w:val="0"/>
+                <w:color w:val="1A3A5C"/>
+                <w:sz w:val="16"/>
+              </w:rPr>
+              <w:t>Kana</w:t>
+            </w:r>
+          </w:p>
+        </w:tc>
+      </w:tr>
+      <w:tr>
+        <w:tc>
+          <w:tcPr>
+            <w:tcW w:type="dxa" w:w="5832"/>
+            <w:shd w:val="clear" w:color="auto" w:fill="FFFFFF"/>
+            <w:vAlign w:val="center"/>
+          </w:tcPr>
+          <w:p>
+            <w:pPr>
+              <w:spacing w:before="20" w:after="20"/>
+              <w:jc w:val="center"/>
+            </w:pPr>
+            <w:r>
+              <w:rPr>
+                <w:rFonts w:ascii="Calibri" w:hAnsi="Calibri"/>
+                <w:b w:val="0"/>
+                <w:i w:val="0"/>
+                <w:color w:val="1A1A2E"/>
+                <w:sz w:val="16"/>
+              </w:rPr>
+              <w:t>i</w:t>
+            </w:r>
+          </w:p>
+        </w:tc>
+        <w:tc>
+          <w:tcPr>
+            <w:tcW w:type="dxa" w:w="5832"/>
+            <w:shd w:val="clear" w:color="auto" w:fill="FFFFFF"/>
+            <w:vAlign w:val="center"/>
+          </w:tcPr>
+          <w:p>
+            <w:pPr>
+              <w:spacing w:before="20" w:after="20"/>
+              <w:jc w:val="center"/>
+            </w:pPr>
+            <w:r>
+              <w:rPr>
+                <w:rFonts w:ascii="Calibri" w:hAnsi="Calibri"/>
+                <w:b/>
+                <w:i w:val="0"/>
+                <w:color w:val="1A3A5C"/>
+                <w:sz w:val="22"/>
+              </w:rPr>
+              <w:t>い</w:t>
+            </w:r>
+          </w:p>
+        </w:tc>
+      </w:tr>
+      <w:tr>
+        <w:tc>
+          <w:tcPr>
+            <w:tcW w:type="dxa" w:w="5832"/>
+            <w:shd w:val="clear" w:color="auto" w:fill="F0F6FA"/>
+            <w:vAlign w:val="center"/>
+          </w:tcPr>
+          <w:p>
+            <w:pPr>
+              <w:spacing w:before="20" w:after="20"/>
+              <w:jc w:val="center"/>
+            </w:pPr>
+            <w:r>
+              <w:rPr>
+                <w:rFonts w:ascii="Calibri" w:hAnsi="Calibri"/>
+                <w:b w:val="0"/>
+                <w:i w:val="0"/>
+                <w:color w:val="1A1A2E"/>
+                <w:sz w:val="16"/>
+              </w:rPr>
+              <w:t>e</w:t>
+            </w:r>
+          </w:p>
+        </w:tc>
+        <w:tc>
+          <w:tcPr>
+            <w:tcW w:type="dxa" w:w="5832"/>
+            <w:shd w:val="clear" w:color="auto" w:fill="F0F6FA"/>
+            <w:vAlign w:val="center"/>
+          </w:tcPr>
+          <w:p>
+            <w:pPr>
+              <w:spacing w:before="20" w:after="20"/>
+              <w:jc w:val="center"/>
+            </w:pPr>
+            <w:r>
+              <w:rPr>
+                <w:rFonts w:ascii="Calibri" w:hAnsi="Calibri"/>
+                <w:b/>
+                <w:i w:val="0"/>
+                <w:color w:val="1A3A5C"/>
+                <w:sz w:val="22"/>
+              </w:rPr>
+              <w:t>え</w:t>
+            </w:r>
+          </w:p>
+        </w:tc>
+      </w:tr>
+      <w:tr>
+        <w:tc>
+          <w:tcPr>
+            <w:tcW w:type="dxa" w:w="5832"/>
+            <w:shd w:val="clear" w:color="auto" w:fill="FFFFFF"/>
+            <w:vAlign w:val="center"/>
+          </w:tcPr>
+          <w:p>
+            <w:pPr>
+              <w:spacing w:before="20" w:after="20"/>
+              <w:jc w:val="center"/>
+            </w:pPr>
+            <w:r>
+              <w:rPr>
+                <w:rFonts w:ascii="Calibri" w:hAnsi="Calibri"/>
+                <w:b w:val="0"/>
+                <w:i w:val="0"/>
+                <w:color w:val="1A1A2E"/>
+                <w:sz w:val="16"/>
+              </w:rPr>
+              <w:t>a</w:t>
+            </w:r>
+          </w:p>
+        </w:tc>
+        <w:tc>
+          <w:tcPr>
+            <w:tcW w:type="dxa" w:w="5832"/>
+            <w:shd w:val="clear" w:color="auto" w:fill="FFFFFF"/>
+            <w:vAlign w:val="center"/>
+          </w:tcPr>
+          <w:p>
+            <w:pPr>
+              <w:spacing w:before="20" w:after="20"/>
+              <w:jc w:val="center"/>
+            </w:pPr>
+            <w:r>
+              <w:rPr>
+                <w:rFonts w:ascii="Calibri" w:hAnsi="Calibri"/>
+                <w:b/>
+                <w:i w:val="0"/>
+                <w:color w:val="1A3A5C"/>
+                <w:sz w:val="22"/>
+              </w:rPr>
+              <w:t>あ</w:t>
+            </w:r>
+          </w:p>
+        </w:tc>
+      </w:tr>
+      <w:tr>
+        <w:tc>
+          <w:tcPr>
+            <w:tcW w:type="dxa" w:w="5832"/>
+            <w:shd w:val="clear" w:color="auto" w:fill="F0F6FA"/>
+            <w:vAlign w:val="center"/>
+          </w:tcPr>
+          <w:p>
+            <w:pPr>
+              <w:spacing w:before="20" w:after="20"/>
+              <w:jc w:val="center"/>
+            </w:pPr>
+            <w:r>
+              <w:rPr>
+                <w:rFonts w:ascii="Calibri" w:hAnsi="Calibri"/>
+                <w:b w:val="0"/>
+                <w:i w:val="0"/>
+                <w:color w:val="1A1A2E"/>
+                <w:sz w:val="16"/>
+              </w:rPr>
+              <w:t>o</w:t>
+            </w:r>
+          </w:p>
+        </w:tc>
+        <w:tc>
+          <w:tcPr>
+            <w:tcW w:type="dxa" w:w="5832"/>
+            <w:shd w:val="clear" w:color="auto" w:fill="F0F6FA"/>
+            <w:vAlign w:val="center"/>
+          </w:tcPr>
+          <w:p>
+            <w:pPr>
+              <w:spacing w:before="20" w:after="20"/>
+              <w:jc w:val="center"/>
+            </w:pPr>
+            <w:r>
+              <w:rPr>
+                <w:rFonts w:ascii="Calibri" w:hAnsi="Calibri"/>
+                <w:b/>
+                <w:i w:val="0"/>
+                <w:color w:val="1A3A5C"/>
+                <w:sz w:val="22"/>
+              </w:rPr>
+              <w:t>お</w:t>
+            </w:r>
+          </w:p>
+        </w:tc>
+      </w:tr>
+    </w:tbl>
+    <w:p>
+      <w:pPr>
+        <w:spacing w:after="0"/>
+      </w:pPr>
+    </w:p>
     <w:p>
       <w:pPr>
         <w:spacing w:before="60" w:after="40"/>
@@ -2430,6 +3037,54 @@
                 <w:sz w:val="18"/>
               </w:rPr>
               <w:t>あ, う, お</w:t>
+            </w:r>
+          </w:p>
+        </w:tc>
+      </w:tr>
+      <w:tr>
+        <w:tc>
+          <w:tcPr>
+            <w:tcW w:type="dxa" w:w="5832"/>
+            <w:shd w:val="clear" w:color="auto" w:fill="F0F6FA"/>
+            <w:vAlign w:val="center"/>
+          </w:tcPr>
+          <w:p>
+            <w:pPr>
+              <w:spacing w:before="20" w:after="20"/>
+              <w:jc w:val="center"/>
+            </w:pPr>
+            <w:r>
+              <w:rPr>
+                <w:rFonts w:ascii="Calibri" w:hAnsi="Calibri"/>
+                <w:b/>
+                <w:i w:val="0"/>
+                <w:color w:val="1A3A5C"/>
+                <w:sz w:val="20"/>
+              </w:rPr>
+              <w:t>お  __  う  __  あ</w:t>
+            </w:r>
+          </w:p>
+        </w:tc>
+        <w:tc>
+          <w:tcPr>
+            <w:tcW w:type="dxa" w:w="5832"/>
+            <w:shd w:val="clear" w:color="auto" w:fill="F0F6FA"/>
+            <w:vAlign w:val="center"/>
+          </w:tcPr>
+          <w:p>
+            <w:pPr>
+              <w:spacing w:before="20" w:after="20"/>
+              <w:jc w:val="center"/>
+            </w:pPr>
+            <w:r>
+              <w:rPr>
+                <w:rFonts w:ascii="Calibri" w:hAnsi="Calibri"/>
+                <w:b w:val="0"/>
+                <w:i w:val="0"/>
+                <w:color w:val="1A1A2E"/>
+                <w:sz w:val="18"/>
+              </w:rPr>
+              <w:t>え, い</w:t>
             </w:r>
           </w:p>
         </w:tc>
@@ -2659,6 +3314,54 @@
           </w:p>
         </w:tc>
       </w:tr>
+      <w:tr>
+        <w:tc>
+          <w:tcPr>
+            <w:tcW w:type="dxa" w:w="5832"/>
+            <w:shd w:val="clear" w:color="auto" w:fill="FFFFFF"/>
+            <w:vAlign w:val="center"/>
+          </w:tcPr>
+          <w:p>
+            <w:pPr>
+              <w:spacing w:before="20" w:after="20"/>
+              <w:jc w:val="center"/>
+            </w:pPr>
+            <w:r>
+              <w:rPr>
+                <w:rFonts w:ascii="Calibri" w:hAnsi="Calibri"/>
+                <w:b/>
+                <w:i w:val="0"/>
+                <w:color w:val="1A3A5C"/>
+                <w:sz w:val="20"/>
+              </w:rPr>
+              <w:t>お   あ   か   う</w:t>
+            </w:r>
+          </w:p>
+        </w:tc>
+        <w:tc>
+          <w:tcPr>
+            <w:tcW w:type="dxa" w:w="5832"/>
+            <w:shd w:val="clear" w:color="auto" w:fill="FFFFFF"/>
+            <w:vAlign w:val="center"/>
+          </w:tcPr>
+          <w:p>
+            <w:pPr>
+              <w:spacing w:before="20" w:after="20"/>
+              <w:jc w:val="center"/>
+            </w:pPr>
+            <w:r>
+              <w:rPr>
+                <w:rFonts w:ascii="Calibri" w:hAnsi="Calibri"/>
+                <w:b w:val="0"/>
+                <w:i w:val="0"/>
+                <w:color w:val="1A1A2E"/>
+                <w:sz w:val="18"/>
+              </w:rPr>
+              <w:t>か</w:t>
+            </w:r>
+          </w:p>
+        </w:tc>
+      </w:tr>
     </w:tbl>
     <w:p>
       <w:pPr>
@@ -2757,7 +3460,7 @@
                 <w:b w:val="0"/>
                 <w:i w:val="0"/>
                 <w:color w:val="1A1A2E"/>
-                <w:sz w:val="16"/>
+                <w:sz w:val="14"/>
               </w:rPr>
               <w:t>This set follows the sound order a, i, u, e, o.</w:t>
             </w:r>
@@ -2780,7 +3483,7 @@
                 <w:b/>
                 <w:i w:val="0"/>
                 <w:color w:val="007A87"/>
-                <w:sz w:val="18"/>
+                <w:sz w:val="16"/>
               </w:rPr>
               <w:t>True</w:t>
             </w:r>
@@ -2804,7 +3507,7 @@
                 <w:b w:val="0"/>
                 <w:i w:val="0"/>
                 <w:color w:val="1A1A2E"/>
-                <w:sz w:val="16"/>
+                <w:sz w:val="14"/>
               </w:rPr>
               <w:t>This set has only three kana.</w:t>
             </w:r>
@@ -2827,7 +3530,7 @@
                 <w:b/>
                 <w:i w:val="0"/>
                 <w:color w:val="007A87"/>
-                <w:sz w:val="18"/>
+                <w:sz w:val="16"/>
               </w:rPr>
               <w:t>False</w:t>
             </w:r>
@@ -2851,7 +3554,7 @@
                 <w:b w:val="0"/>
                 <w:i w:val="0"/>
                 <w:color w:val="1A1A2E"/>
-                <w:sz w:val="16"/>
+                <w:sz w:val="14"/>
               </w:rPr>
               <w:t>The last sound in this set is o.</w:t>
             </w:r>
@@ -2874,7 +3577,54 @@
                 <w:b/>
                 <w:i w:val="0"/>
                 <w:color w:val="007A87"/>
-                <w:sz w:val="18"/>
+                <w:sz w:val="16"/>
+              </w:rPr>
+              <w:t>True</w:t>
+            </w:r>
+          </w:p>
+        </w:tc>
+      </w:tr>
+      <w:tr>
+        <w:tc>
+          <w:tcPr>
+            <w:tcW w:type="dxa" w:w="5832"/>
+            <w:shd w:val="clear" w:color="auto" w:fill="FFFFFF"/>
+            <w:vAlign w:val="center"/>
+          </w:tcPr>
+          <w:p>
+            <w:pPr>
+              <w:spacing w:before="20" w:after="20"/>
+            </w:pPr>
+            <w:r>
+              <w:rPr>
+                <w:rFonts w:ascii="Calibri" w:hAnsi="Calibri"/>
+                <w:b w:val="0"/>
+                <w:i w:val="0"/>
+                <w:color w:val="1A1A2E"/>
+                <w:sz w:val="14"/>
+              </w:rPr>
+              <w:t>The first sound in this set is a.</w:t>
+            </w:r>
+          </w:p>
+        </w:tc>
+        <w:tc>
+          <w:tcPr>
+            <w:tcW w:type="dxa" w:w="5832"/>
+            <w:shd w:val="clear" w:color="auto" w:fill="FFFFFF"/>
+            <w:vAlign w:val="center"/>
+          </w:tcPr>
+          <w:p>
+            <w:pPr>
+              <w:spacing w:before="20" w:after="20"/>
+              <w:jc w:val="center"/>
+            </w:pPr>
+            <w:r>
+              <w:rPr>
+                <w:rFonts w:ascii="Calibri" w:hAnsi="Calibri"/>
+                <w:b/>
+                <w:i w:val="0"/>
+                <w:color w:val="007A87"/>
+                <w:sz w:val="16"/>
               </w:rPr>
               <w:t>True</w:t>
             </w:r>
@@ -2886,151 +3636,6 @@
       <w:pPr>
         <w:spacing w:after="0"/>
       </w:pPr>
-    </w:p>
-    <w:p>
-      <w:pPr>
-        <w:spacing w:before="80" w:after="40"/>
-      </w:pPr>
-      <w:r>
-        <w:rPr>
-          <w:rFonts w:ascii="Calibri" w:hAnsi="Calibri"/>
-          <w:b/>
-          <w:i w:val="0"/>
-          <w:color w:val="007A87"/>
-          <w:sz w:val="24"/>
-        </w:rPr>
-        <w:t>Quick review</w:t>
-      </w:r>
-    </w:p>
-    <w:p>
-      <w:pPr>
-        <w:spacing w:before="0" w:after="0"/>
-        <w:ind w:left="340"/>
-      </w:pPr>
-      <w:r>
-        <w:rPr>
-          <w:rFonts w:ascii="Calibri" w:hAnsi="Calibri"/>
-          <w:b/>
-          <w:i w:val="0"/>
-          <w:color w:val="E6A817"/>
-          <w:sz w:val="18"/>
-        </w:rPr>
-        <w:t xml:space="preserve">▸ </w:t>
-      </w:r>
-      <w:r>
-        <w:rPr>
-          <w:rFonts w:ascii="Calibri" w:hAnsi="Calibri"/>
-          <w:b w:val="0"/>
-          <w:i w:val="0"/>
-          <w:color w:val="1A1A2E"/>
-          <w:sz w:val="18"/>
-        </w:rPr>
-        <w:t>One hiragana usually represents one sound beat.</w:t>
-      </w:r>
-    </w:p>
-    <w:p>
-      <w:pPr>
-        <w:spacing w:before="0" w:after="0"/>
-        <w:ind w:left="340"/>
-      </w:pPr>
-      <w:r>
-        <w:rPr>
-          <w:rFonts w:ascii="Calibri" w:hAnsi="Calibri"/>
-          <w:b/>
-          <w:i w:val="0"/>
-          <w:color w:val="E6A817"/>
-          <w:sz w:val="18"/>
-        </w:rPr>
-        <w:t xml:space="preserve">▸ </w:t>
-      </w:r>
-      <w:r>
-        <w:rPr>
-          <w:rFonts w:ascii="Calibri" w:hAnsi="Calibri"/>
-          <w:b w:val="0"/>
-          <w:i w:val="0"/>
-          <w:color w:val="1A1A2E"/>
-          <w:sz w:val="18"/>
-        </w:rPr>
-        <w:t>Most rows follow the vowel order a, i, u, e, o.</w:t>
-      </w:r>
-    </w:p>
-    <w:p>
-      <w:pPr>
-        <w:spacing w:before="0" w:after="0"/>
-        <w:ind w:left="340"/>
-      </w:pPr>
-      <w:r>
-        <w:rPr>
-          <w:rFonts w:ascii="Calibri" w:hAnsi="Calibri"/>
-          <w:b/>
-          <w:i w:val="0"/>
-          <w:color w:val="E6A817"/>
-          <w:sz w:val="18"/>
-        </w:rPr>
-        <w:t xml:space="preserve">▸ </w:t>
-      </w:r>
-      <w:r>
-        <w:rPr>
-          <w:rFonts w:ascii="Calibri" w:hAnsi="Calibri"/>
-          <w:b w:val="0"/>
-          <w:i w:val="0"/>
-          <w:color w:val="1A1A2E"/>
-          <w:sz w:val="18"/>
-        </w:rPr>
-        <w:t>Point to one letter at a time and say the full sound in one step.</w:t>
-      </w:r>
-    </w:p>
-    <w:p>
-      <w:pPr>
-        <w:spacing w:before="0" w:after="0"/>
-        <w:ind w:left="340"/>
-      </w:pPr>
-      <w:r>
-        <w:rPr>
-          <w:rFonts w:ascii="Calibri" w:hAnsi="Calibri"/>
-          <w:b/>
-          <w:i w:val="0"/>
-          <w:color w:val="E6A817"/>
-          <w:sz w:val="18"/>
-        </w:rPr>
-        <w:t xml:space="preserve">▸ </w:t>
-      </w:r>
-      <w:r>
-        <w:rPr>
-          <w:rFonts w:ascii="Calibri" w:hAnsi="Calibri"/>
-          <w:b w:val="0"/>
-          <w:i w:val="0"/>
-          <w:color w:val="1A1A2E"/>
-          <w:sz w:val="18"/>
-        </w:rPr>
-        <w:t>These five vowels are the sound base for all the other hiragana rows.</w:t>
-      </w:r>
-    </w:p>
-    <w:p>
-      <w:pPr>
-        <w:spacing w:before="0" w:after="0"/>
-        <w:ind w:left="340"/>
-      </w:pPr>
-      <w:r>
-        <w:rPr>
-          <w:rFonts w:ascii="Calibri" w:hAnsi="Calibri"/>
-          <w:b/>
-          <w:i w:val="0"/>
-          <w:color w:val="E6A817"/>
-          <w:sz w:val="18"/>
-        </w:rPr>
-        <w:t xml:space="preserve">▸ </w:t>
-      </w:r>
-      <w:r>
-        <w:rPr>
-          <w:rFonts w:ascii="Calibri" w:hAnsi="Calibri"/>
-          <w:b w:val="0"/>
-          <w:i w:val="0"/>
-          <w:color w:val="1A1A2E"/>
-          <w:sz w:val="18"/>
-        </w:rPr>
-        <w:t>Set order: あ, い, う, え, お | Sound order: a, i, u, e, o</w:t>
-      </w:r>
     </w:p>
     <w:sectPr>
       <w:footerReference w:type="default" r:id="rId9"/>

</xml_diff>